<commit_message>
updated the DOCX templete
</commit_message>
<xml_diff>
--- a/assets/template_clean.docx
+++ b/assets/template_clean.docx
@@ -1,39 +1,33 @@
 
 <file path=word/document.xml><?xml version="1.0" encoding="utf-8"?>
-<w:document xmlns:wp14="http://schemas.microsoft.com/office/word/2010/wordprocessingDrawing" xmlns:mc="http://schemas.openxmlformats.org/markup-compatibility/2006" xmlns:ve="http://schemas.openxmlformats.org/markup-compatibility/2006" xmlns:o="urn:schemas-microsoft-com:office:office" xmlns:r="http://schemas.openxmlformats.org/officeDocument/2006/relationships" xmlns:m="http://schemas.openxmlformats.org/officeDocument/2006/math" xmlns:v="urn:schemas-microsoft-com:vml" xmlns:wp="http://schemas.openxmlformats.org/drawingml/2006/wordprocessingDrawing" xmlns:w10="urn:schemas-microsoft-com:office:word" xmlns:w="http://schemas.openxmlformats.org/wordprocessingml/2006/main" xmlns:wne="http://schemas.microsoft.com/office/word/2006/wordml" xmlns:a="http://schemas.openxmlformats.org/drawingml/2006/main" xmlns:pic="http://schemas.openxmlformats.org/drawingml/2006/picture" xmlns:wpg="http://schemas.microsoft.com/office/word/2010/wordprocessingGroup" xmlns:wps="http://schemas.microsoft.com/office/word/2010/wordprocessingShape" xmlns:w14="http://schemas.microsoft.com/office/word/2010/wordml" xmlns:a14="http://schemas.microsoft.com/office/drawing/2010/main" mc:Ignorable="w14 wp14" xml:space="preserve">
+<w:document xmlns:wpc="http://schemas.microsoft.com/office/word/2010/wordprocessingCanvas" xmlns:cx="http://schemas.microsoft.com/office/drawing/2014/chartex" xmlns:cx1="http://schemas.microsoft.com/office/drawing/2015/9/8/chartex" xmlns:cx2="http://schemas.microsoft.com/office/drawing/2015/10/21/chartex" xmlns:cx3="http://schemas.microsoft.com/office/drawing/2016/5/9/chartex" xmlns:cx4="http://schemas.microsoft.com/office/drawing/2016/5/10/chartex" xmlns:cx5="http://schemas.microsoft.com/office/drawing/2016/5/11/chartex" xmlns:cx6="http://schemas.microsoft.com/office/drawing/2016/5/12/chartex" xmlns:cx7="http://schemas.microsoft.com/office/drawing/2016/5/13/chartex" xmlns:cx8="http://schemas.microsoft.com/office/drawing/2016/5/14/chartex" xmlns:mc="http://schemas.openxmlformats.org/markup-compatibility/2006" xmlns:aink="http://schemas.microsoft.com/office/drawing/2016/ink" xmlns:am3d="http://schemas.microsoft.com/office/drawing/2017/model3d" xmlns:o="urn:schemas-microsoft-com:office:office" xmlns:oel="http://schemas.microsoft.com/office/2019/extlst" xmlns:r="http://schemas.openxmlformats.org/officeDocument/2006/relationships" xmlns:m="http://schemas.openxmlformats.org/officeDocument/2006/math" xmlns:v="urn:schemas-microsoft-com:vml" xmlns:wp14="http://schemas.microsoft.com/office/word/2010/wordprocessingDrawing" xmlns:wp="http://schemas.openxmlformats.org/drawingml/2006/wordprocessingDrawing" xmlns:w10="urn:schemas-microsoft-com:office:word" xmlns:w="http://schemas.openxmlformats.org/wordprocessingml/2006/main" xmlns:w14="http://schemas.microsoft.com/office/word/2010/wordml" xmlns:w15="http://schemas.microsoft.com/office/word/2012/wordml" xmlns:w16cex="http://schemas.microsoft.com/office/word/2018/wordml/cex" xmlns:w16cid="http://schemas.microsoft.com/office/word/2016/wordml/cid" xmlns:w16="http://schemas.microsoft.com/office/word/2018/wordml" xmlns:w16sdtdh="http://schemas.microsoft.com/office/word/2020/wordml/sdtdatahash" xmlns:w16se="http://schemas.microsoft.com/office/word/2015/wordml/symex" xmlns:wpg="http://schemas.microsoft.com/office/word/2010/wordprocessingGroup" xmlns:wpi="http://schemas.microsoft.com/office/word/2010/wordprocessingInk" xmlns:wne="http://schemas.microsoft.com/office/word/2006/wordml" xmlns:wps="http://schemas.microsoft.com/office/word/2010/wordprocessingShape" mc:Ignorable="w14 w15 w16se w16cid w16 w16cex w16sdtdh wp14">
   <w:body>
     <w:p>
       <w:pPr>
-        <w:spacing w:before="0" w:after="60" w:line="276" w:lineRule="auto"/>
-        <w:ind w:left="0" w:firstLine="0"/>
-        <w:rPr>
-          <w:rFonts w:ascii="Calibri"/>
-          <w:sz w:val="22"/>
-        </w:rPr>
-      </w:pPr>
-      <w:r>
-        <w:rPr>
-          <w:rFonts w:ascii="Calibri"/>
-          <w:sz w:val="22"/>
-        </w:rPr>
-        <w:t xml:space="preserve">{{NAME}}</w:t>
+        <w:spacing w:after="60" w:line="276" w:lineRule="auto"/>
+        <w:rPr>
+          <w:rFonts w:ascii="Calibri"/>
+        </w:rPr>
+      </w:pPr>
+      <w:r>
+        <w:rPr>
+          <w:rFonts w:ascii="Calibri"/>
+        </w:rPr>
+        <w:t>{{NAME}}</w:t>
       </w:r>
     </w:p>
     <w:p>
       <w:pPr>
-        <w:spacing w:before="0" w:after="60" w:line="276" w:lineRule="auto"/>
-        <w:ind w:left="0" w:firstLine="0"/>
-        <w:rPr>
-          <w:rFonts w:ascii="Calibri"/>
-          <w:sz w:val="22"/>
-        </w:rPr>
-      </w:pPr>
-      <w:r>
-        <w:rPr>
-          <w:rFonts w:ascii="Calibri"/>
-          <w:sz w:val="22"/>
-        </w:rPr>
-        <w:t xml:space="preserve">{{CONTACT}}</w:t>
+        <w:spacing w:after="60" w:line="276" w:lineRule="auto"/>
+        <w:rPr>
+          <w:rFonts w:ascii="Calibri"/>
+        </w:rPr>
+      </w:pPr>
+      <w:r>
+        <w:rPr>
+          <w:rFonts w:ascii="Calibri"/>
+        </w:rPr>
+        <w:t>{{CONTACT}}</w:t>
       </w:r>
     </w:p>
     <w:p>
@@ -42,14 +36,12 @@
         <w:spacing w:before="120" w:after="60"/>
         <w:rPr>
           <w:rFonts w:ascii="Calibri"/>
-          <w:b/>
-          <w:sz w:val="26" w:color="001f5f"/>
-        </w:rPr>
-      </w:pPr>
-      <w:r>
-        <w:rPr>
-          <w:rFonts w:ascii="Calibri"/>
-          <w:b/>
+          <w:sz w:val="26"/>
+        </w:rPr>
+      </w:pPr>
+      <w:r>
+        <w:rPr>
+          <w:rFonts w:ascii="Calibri"/>
           <w:sz w:val="26"/>
         </w:rPr>
         <w:t>{{PROFESSIONAL_SUMMARY_TITLE}}</w:t>
@@ -57,20 +49,31 @@
     </w:p>
     <w:p>
       <w:pPr>
-        <w:pStyle w:val="ListBullet"/>
-        <w:spacing w:before="0" w:after="30" w:line="276" w:lineRule="auto"/>
+        <w:spacing w:after="30" w:line="276" w:lineRule="auto"/>
         <w:ind w:left="720" w:hanging="720"/>
         <w:rPr>
           <w:rFonts w:ascii="Calibri"/>
-          <w:sz w:val="22"/>
-        </w:rPr>
-      </w:pPr>
-      <w:r>
-        <w:rPr>
-          <w:rFonts w:ascii="Calibri"/>
-          <w:sz w:val="22"/>
-        </w:rPr>
-        <w:t>{{#PROFESSIONAL_SUMMARY}}{{.}}{{/PROFESSIONAL_SUMMARY}}</w:t>
+        </w:rPr>
+      </w:pPr>
+      <w:r>
+        <w:rPr>
+          <w:rFonts w:ascii="Calibri"/>
+        </w:rPr>
+        <w:t>{{#PROFESSIONAL_SUMMARY</w:t>
+      </w:r>
+      <w:proofErr w:type="gramStart"/>
+      <w:r>
+        <w:rPr>
+          <w:rFonts w:ascii="Calibri"/>
+        </w:rPr>
+        <w:t>}}{</w:t>
+      </w:r>
+      <w:proofErr w:type="gramEnd"/>
+      <w:r>
+        <w:rPr>
+          <w:rFonts w:ascii="Calibri"/>
+        </w:rPr>
+        <w:t>{.}}{{/PROFESSIONAL_SUMMARY}}</w:t>
       </w:r>
     </w:p>
     <w:p>
@@ -79,14 +82,12 @@
         <w:spacing w:before="120" w:after="60"/>
         <w:rPr>
           <w:rFonts w:ascii="Calibri"/>
-          <w:b/>
-          <w:sz w:val="26" w:color="001f5f"/>
-        </w:rPr>
-      </w:pPr>
-      <w:r>
-        <w:rPr>
-          <w:rFonts w:ascii="Calibri"/>
-          <w:b/>
+          <w:sz w:val="26"/>
+        </w:rPr>
+      </w:pPr>
+      <w:r>
+        <w:rPr>
+          <w:rFonts w:ascii="Calibri"/>
           <w:sz w:val="26"/>
         </w:rPr>
         <w:t>{{EXPERTISE_TITLE}}</w:t>
@@ -94,20 +95,31 @@
     </w:p>
     <w:p>
       <w:pPr>
-        <w:pStyle w:val="ListBullet"/>
-        <w:spacing w:before="0" w:after="30" w:line="276" w:lineRule="auto"/>
+        <w:spacing w:after="30" w:line="276" w:lineRule="auto"/>
         <w:ind w:left="720" w:hanging="720"/>
         <w:rPr>
           <w:rFonts w:ascii="Calibri"/>
-          <w:sz w:val="22"/>
-        </w:rPr>
-      </w:pPr>
-      <w:r>
-        <w:rPr>
-          <w:rFonts w:ascii="Calibri"/>
-          <w:sz w:val="22"/>
-        </w:rPr>
-        <w:t>{{#EXPERTISE}}{{.}}{{/EXPERTISE}}</w:t>
+        </w:rPr>
+      </w:pPr>
+      <w:r>
+        <w:rPr>
+          <w:rFonts w:ascii="Calibri"/>
+        </w:rPr>
+        <w:t>{{#EXPERTISE</w:t>
+      </w:r>
+      <w:proofErr w:type="gramStart"/>
+      <w:r>
+        <w:rPr>
+          <w:rFonts w:ascii="Calibri"/>
+        </w:rPr>
+        <w:t>}}{</w:t>
+      </w:r>
+      <w:proofErr w:type="gramEnd"/>
+      <w:r>
+        <w:rPr>
+          <w:rFonts w:ascii="Calibri"/>
+        </w:rPr>
+        <w:t>{.}}{{/EXPERTISE}}</w:t>
       </w:r>
     </w:p>
     <w:p>
@@ -116,14 +128,12 @@
         <w:spacing w:before="120" w:after="60"/>
         <w:rPr>
           <w:rFonts w:ascii="Calibri"/>
-          <w:b/>
-          <w:sz w:val="26" w:color="001f5f"/>
-        </w:rPr>
-      </w:pPr>
-      <w:r>
-        <w:rPr>
-          <w:rFonts w:ascii="Calibri"/>
-          <w:b/>
+          <w:sz w:val="26"/>
+        </w:rPr>
+      </w:pPr>
+      <w:r>
+        <w:rPr>
+          <w:rFonts w:ascii="Calibri"/>
           <w:sz w:val="26"/>
         </w:rPr>
         <w:t>{{EDUCATION_TITLE}}</w:t>
@@ -131,20 +141,31 @@
     </w:p>
     <w:p>
       <w:pPr>
-        <w:pStyle w:val="ListBullet"/>
-        <w:spacing w:before="0" w:after="30" w:line="276" w:lineRule="auto"/>
+        <w:spacing w:after="30" w:line="276" w:lineRule="auto"/>
         <w:ind w:left="720" w:hanging="720"/>
         <w:rPr>
           <w:rFonts w:ascii="Calibri"/>
-          <w:sz w:val="22"/>
-        </w:rPr>
-      </w:pPr>
-      <w:r>
-        <w:rPr>
-          <w:rFonts w:ascii="Calibri"/>
-          <w:sz w:val="22"/>
-        </w:rPr>
-        <w:t>{{#EDUCATION}}{{.}}{{/EDUCATION}}</w:t>
+        </w:rPr>
+      </w:pPr>
+      <w:r>
+        <w:rPr>
+          <w:rFonts w:ascii="Calibri"/>
+        </w:rPr>
+        <w:t>{{#EDUCATION</w:t>
+      </w:r>
+      <w:proofErr w:type="gramStart"/>
+      <w:r>
+        <w:rPr>
+          <w:rFonts w:ascii="Calibri"/>
+        </w:rPr>
+        <w:t>}}{</w:t>
+      </w:r>
+      <w:proofErr w:type="gramEnd"/>
+      <w:r>
+        <w:rPr>
+          <w:rFonts w:ascii="Calibri"/>
+        </w:rPr>
+        <w:t>{.}}{{/EDUCATION}}</w:t>
       </w:r>
     </w:p>
     <w:p>
@@ -153,14 +174,12 @@
         <w:spacing w:before="120" w:after="60"/>
         <w:rPr>
           <w:rFonts w:ascii="Calibri"/>
-          <w:b/>
-          <w:sz w:val="26" w:color="001f5f"/>
-        </w:rPr>
-      </w:pPr>
-      <w:r>
-        <w:rPr>
-          <w:rFonts w:ascii="Calibri"/>
-          <w:b/>
+          <w:sz w:val="26"/>
+        </w:rPr>
+      </w:pPr>
+      <w:r>
+        <w:rPr>
+          <w:rFonts w:ascii="Calibri"/>
           <w:sz w:val="26"/>
         </w:rPr>
         <w:t>{{SKILLS_TITLE}}</w:t>
@@ -168,19 +187,30 @@
     </w:p>
     <w:p>
       <w:pPr>
-        <w:spacing w:before="0" w:after="60" w:line="276" w:lineRule="auto"/>
-        <w:ind w:left="0" w:firstLine="0"/>
-        <w:rPr>
-          <w:rFonts w:ascii="Calibri"/>
-          <w:sz w:val="22"/>
-        </w:rPr>
-      </w:pPr>
-      <w:r>
-        <w:rPr>
-          <w:rFonts w:ascii="Calibri"/>
-          <w:sz w:val="22"/>
-        </w:rPr>
-        <w:t xml:space="preserve">{{#SKILLS}}{{CATEGORY}} | {{ITEMS}}{{/SKILLS}}</w:t>
+        <w:spacing w:after="60" w:line="276" w:lineRule="auto"/>
+        <w:rPr>
+          <w:rFonts w:ascii="Calibri"/>
+        </w:rPr>
+      </w:pPr>
+      <w:r>
+        <w:rPr>
+          <w:rFonts w:ascii="Calibri"/>
+        </w:rPr>
+        <w:t>{{#SKILLS</w:t>
+      </w:r>
+      <w:proofErr w:type="gramStart"/>
+      <w:r>
+        <w:rPr>
+          <w:rFonts w:ascii="Calibri"/>
+        </w:rPr>
+        <w:t>}}{</w:t>
+      </w:r>
+      <w:proofErr w:type="gramEnd"/>
+      <w:r>
+        <w:rPr>
+          <w:rFonts w:ascii="Calibri"/>
+        </w:rPr>
+        <w:t>{CATEGORY}} | {{ITEMS}}{{/SKILLS}}</w:t>
       </w:r>
     </w:p>
     <w:p>
@@ -189,14 +219,12 @@
         <w:spacing w:before="120" w:after="60"/>
         <w:rPr>
           <w:rFonts w:ascii="Calibri"/>
-          <w:b/>
-          <w:sz w:val="26" w:color="001f5f"/>
-        </w:rPr>
-      </w:pPr>
-      <w:r>
-        <w:rPr>
-          <w:rFonts w:ascii="Calibri"/>
-          <w:b/>
+          <w:sz w:val="26"/>
+        </w:rPr>
+      </w:pPr>
+      <w:r>
+        <w:rPr>
+          <w:rFonts w:ascii="Calibri"/>
           <w:sz w:val="26"/>
         </w:rPr>
         <w:t>{{WORK_TITLE}}</w:t>
@@ -204,19 +232,30 @@
     </w:p>
     <w:p>
       <w:pPr>
-        <w:spacing w:before="0" w:after="60" w:line="276" w:lineRule="auto"/>
-        <w:ind w:left="0" w:firstLine="0"/>
-        <w:rPr>
-          <w:rFonts w:ascii="Calibri"/>
-          <w:sz w:val="22"/>
-        </w:rPr>
-      </w:pPr>
-      <w:r>
-        <w:rPr>
-          <w:rFonts w:ascii="Calibri"/>
-          <w:sz w:val="22"/>
-        </w:rPr>
-        <w:t xml:space="preserve">{{#WORK}}{{COMPANY}} | {{ROLE}} | {{DURATION}}{{/WORK}}</w:t>
+        <w:spacing w:after="60" w:line="276" w:lineRule="auto"/>
+        <w:rPr>
+          <w:rFonts w:ascii="Calibri"/>
+        </w:rPr>
+      </w:pPr>
+      <w:r>
+        <w:rPr>
+          <w:rFonts w:ascii="Calibri"/>
+        </w:rPr>
+        <w:t>{{#WORK</w:t>
+      </w:r>
+      <w:proofErr w:type="gramStart"/>
+      <w:r>
+        <w:rPr>
+          <w:rFonts w:ascii="Calibri"/>
+        </w:rPr>
+        <w:t>}}{</w:t>
+      </w:r>
+      <w:proofErr w:type="gramEnd"/>
+      <w:r>
+        <w:rPr>
+          <w:rFonts w:ascii="Calibri"/>
+        </w:rPr>
+        <w:t>{COMPANY}} | {{ROLE}} | {{DURATION}}{{/WORK}}</w:t>
       </w:r>
     </w:p>
     <w:p>
@@ -225,14 +264,12 @@
         <w:spacing w:before="120" w:after="60"/>
         <w:rPr>
           <w:rFonts w:ascii="Calibri"/>
-          <w:b/>
-          <w:sz w:val="26" w:color="001f5f"/>
-        </w:rPr>
-      </w:pPr>
-      <w:r>
-        <w:rPr>
-          <w:rFonts w:ascii="Calibri"/>
-          <w:b/>
+          <w:sz w:val="26"/>
+        </w:rPr>
+      </w:pPr>
+      <w:r>
+        <w:rPr>
+          <w:rFonts w:ascii="Calibri"/>
           <w:sz w:val="26"/>
         </w:rPr>
         <w:t>{{EXPERIENCE_TITLE}}</w:t>
@@ -240,21 +277,31 @@
     </w:p>
     <w:p>
       <w:pPr>
-        <w:pStyle w:val="ListBullet"/>
-        <w:spacing w:before="0" w:after="30" w:line="276" w:lineRule="auto"/>
+        <w:spacing w:after="30" w:line="276" w:lineRule="auto"/>
         <w:ind w:left="720" w:hanging="720"/>
         <w:rPr>
           <w:rFonts w:ascii="Calibri"/>
-          <w:sz w:val="22"/>
-        </w:rPr>
-      </w:pPr>
-      <w:r>
-        <w:rPr>
-          <w:rFonts w:ascii="Calibri"/>
-          <w:sz w:val="22"/>
-        </w:rPr>
-        <w:t>{{#EXPERIENCE}}{{ROLE}} ({{DURATION}}){{#POINTS}}
- - {{.}}{{/POINTS}}{{/EXPERIENCE}}</w:t>
+        </w:rPr>
+      </w:pPr>
+      <w:r>
+        <w:rPr>
+          <w:rFonts w:ascii="Calibri"/>
+        </w:rPr>
+        <w:t>{{#EXPERIENCE</w:t>
+      </w:r>
+      <w:proofErr w:type="gramStart"/>
+      <w:r>
+        <w:rPr>
+          <w:rFonts w:ascii="Calibri"/>
+        </w:rPr>
+        <w:t>}}{</w:t>
+      </w:r>
+      <w:proofErr w:type="gramEnd"/>
+      <w:r>
+        <w:rPr>
+          <w:rFonts w:ascii="Calibri"/>
+        </w:rPr>
+        <w:t>{ROLE}} ({{DURATION}}){{#POINTS}}  - {{.}}{{/POINTS}}{{/EXPERIENCE}}</w:t>
       </w:r>
     </w:p>
     <w:p>
@@ -263,14 +310,12 @@
         <w:spacing w:before="120" w:after="60"/>
         <w:rPr>
           <w:rFonts w:ascii="Calibri"/>
-          <w:b/>
-          <w:sz w:val="26" w:color="001f5f"/>
-        </w:rPr>
-      </w:pPr>
-      <w:r>
-        <w:rPr>
-          <w:rFonts w:ascii="Calibri"/>
-          <w:b/>
+          <w:sz w:val="26"/>
+        </w:rPr>
+      </w:pPr>
+      <w:r>
+        <w:rPr>
+          <w:rFonts w:ascii="Calibri"/>
           <w:sz w:val="26"/>
         </w:rPr>
         <w:t>{{CERTIFICATIONS_TITLE}}</w:t>
@@ -278,20 +323,31 @@
     </w:p>
     <w:p>
       <w:pPr>
-        <w:pStyle w:val="ListBullet"/>
-        <w:spacing w:before="0" w:after="30" w:line="276" w:lineRule="auto"/>
+        <w:spacing w:after="30" w:line="276" w:lineRule="auto"/>
         <w:ind w:left="720" w:hanging="720"/>
         <w:rPr>
           <w:rFonts w:ascii="Calibri"/>
-          <w:sz w:val="22"/>
-        </w:rPr>
-      </w:pPr>
-      <w:r>
-        <w:rPr>
-          <w:rFonts w:ascii="Calibri"/>
-          <w:sz w:val="22"/>
-        </w:rPr>
-        <w:t>{{#CERTIFICATIONS}}{{.}}{{/CERTIFICATIONS}}</w:t>
+        </w:rPr>
+      </w:pPr>
+      <w:r>
+        <w:rPr>
+          <w:rFonts w:ascii="Calibri"/>
+        </w:rPr>
+        <w:t>{{#CERTIFICATIONS</w:t>
+      </w:r>
+      <w:proofErr w:type="gramStart"/>
+      <w:r>
+        <w:rPr>
+          <w:rFonts w:ascii="Calibri"/>
+        </w:rPr>
+        <w:t>}}{</w:t>
+      </w:r>
+      <w:proofErr w:type="gramEnd"/>
+      <w:r>
+        <w:rPr>
+          <w:rFonts w:ascii="Calibri"/>
+        </w:rPr>
+        <w:t>{.}}{{/CERTIFICATIONS}}</w:t>
       </w:r>
     </w:p>
     <w:p>
@@ -300,14 +356,12 @@
         <w:spacing w:before="120" w:after="60"/>
         <w:rPr>
           <w:rFonts w:ascii="Calibri"/>
-          <w:b/>
-          <w:sz w:val="26" w:color="001f5f"/>
-        </w:rPr>
-      </w:pPr>
-      <w:r>
-        <w:rPr>
-          <w:rFonts w:ascii="Calibri"/>
-          <w:b/>
+          <w:sz w:val="26"/>
+        </w:rPr>
+      </w:pPr>
+      <w:r>
+        <w:rPr>
+          <w:rFonts w:ascii="Calibri"/>
           <w:sz w:val="26"/>
         </w:rPr>
         <w:t>{{ACHIEVEMENTS_TITLE}}</w:t>
@@ -315,38 +369,68 @@
     </w:p>
     <w:p>
       <w:pPr>
-        <w:pStyle w:val="ListBullet"/>
-        <w:spacing w:before="0" w:after="30" w:line="276" w:lineRule="auto"/>
+        <w:spacing w:after="30" w:line="276" w:lineRule="auto"/>
         <w:ind w:left="720" w:hanging="720"/>
         <w:rPr>
           <w:rFonts w:ascii="Calibri"/>
-          <w:sz w:val="22"/>
-        </w:rPr>
-      </w:pPr>
-      <w:r>
-        <w:rPr>
-          <w:rFonts w:ascii="Calibri"/>
-          <w:sz w:val="22"/>
-        </w:rPr>
-        <w:t>{{#ACHIEVEMENTS}}{{.}}{{/ACHIEVEMENTS}}</w:t>
+        </w:rPr>
+      </w:pPr>
+      <w:r>
+        <w:rPr>
+          <w:rFonts w:ascii="Calibri"/>
+        </w:rPr>
+        <w:t>{{#ACHIEVEMENTS</w:t>
+      </w:r>
+      <w:proofErr w:type="gramStart"/>
+      <w:r>
+        <w:rPr>
+          <w:rFonts w:ascii="Calibri"/>
+        </w:rPr>
+        <w:t>}}{</w:t>
+      </w:r>
+      <w:proofErr w:type="gramEnd"/>
+      <w:r>
+        <w:rPr>
+          <w:rFonts w:ascii="Calibri"/>
+        </w:rPr>
+        <w:t>{.}}{{/ACHIEVEMENTS}}</w:t>
       </w:r>
     </w:p>
     <w:sectPr>
-      <w:headerReference w:type="default" r:id="rIdHdr"/>
-      <w:footerReference w:type="default" r:id="rId5"/>
+      <w:headerReference w:type="default" r:id="rId7"/>
+      <w:footerReference w:type="default" r:id="rId8"/>
       <w:type w:val="continuous"/>
-      <w:pgSz w:w="11920" w:h="16840" w:orient="portrait"/>
-      <w:pgMar w:top="1531" w:right="708" w:bottom="1220" w:left="708" w:header="0" w:footer="1033"/>
+      <w:pgSz w:w="11920" w:h="16840"/>
+      <w:pgMar w:top="1531" w:right="708" w:bottom="1220" w:left="708" w:header="0" w:footer="1033" w:gutter="0"/>
       <w:pgNumType w:start="1"/>
-      <w:cols w:num="1"/>
+      <w:cols w:space="720"/>
     </w:sectPr>
   </w:body>
 </w:document>
 </file>
 
+<file path=word/endnotes.xml><?xml version="1.0" encoding="utf-8"?>
+<w:endnotes xmlns:wpc="http://schemas.microsoft.com/office/word/2010/wordprocessingCanvas" xmlns:cx="http://schemas.microsoft.com/office/drawing/2014/chartex" xmlns:cx1="http://schemas.microsoft.com/office/drawing/2015/9/8/chartex" xmlns:cx2="http://schemas.microsoft.com/office/drawing/2015/10/21/chartex" xmlns:cx3="http://schemas.microsoft.com/office/drawing/2016/5/9/chartex" xmlns:cx4="http://schemas.microsoft.com/office/drawing/2016/5/10/chartex" xmlns:cx5="http://schemas.microsoft.com/office/drawing/2016/5/11/chartex" xmlns:cx6="http://schemas.microsoft.com/office/drawing/2016/5/12/chartex" xmlns:cx7="http://schemas.microsoft.com/office/drawing/2016/5/13/chartex" xmlns:cx8="http://schemas.microsoft.com/office/drawing/2016/5/14/chartex" xmlns:mc="http://schemas.openxmlformats.org/markup-compatibility/2006" xmlns:aink="http://schemas.microsoft.com/office/drawing/2016/ink" xmlns:am3d="http://schemas.microsoft.com/office/drawing/2017/model3d" xmlns:o="urn:schemas-microsoft-com:office:office" xmlns:oel="http://schemas.microsoft.com/office/2019/extlst" xmlns:r="http://schemas.openxmlformats.org/officeDocument/2006/relationships" xmlns:m="http://schemas.openxmlformats.org/officeDocument/2006/math" xmlns:v="urn:schemas-microsoft-com:vml" xmlns:wp14="http://schemas.microsoft.com/office/word/2010/wordprocessingDrawing" xmlns:wp="http://schemas.openxmlformats.org/drawingml/2006/wordprocessingDrawing" xmlns:w10="urn:schemas-microsoft-com:office:word" xmlns:w="http://schemas.openxmlformats.org/wordprocessingml/2006/main" xmlns:w14="http://schemas.microsoft.com/office/word/2010/wordml" xmlns:w15="http://schemas.microsoft.com/office/word/2012/wordml" xmlns:w16cex="http://schemas.microsoft.com/office/word/2018/wordml/cex" xmlns:w16cid="http://schemas.microsoft.com/office/word/2016/wordml/cid" xmlns:w16="http://schemas.microsoft.com/office/word/2018/wordml" xmlns:w16sdtdh="http://schemas.microsoft.com/office/word/2020/wordml/sdtdatahash" xmlns:w16se="http://schemas.microsoft.com/office/word/2015/wordml/symex" xmlns:wpg="http://schemas.microsoft.com/office/word/2010/wordprocessingGroup" xmlns:wpi="http://schemas.microsoft.com/office/word/2010/wordprocessingInk" xmlns:wne="http://schemas.microsoft.com/office/word/2006/wordml" xmlns:wps="http://schemas.microsoft.com/office/word/2010/wordprocessingShape" mc:Ignorable="w14 w15 w16se w16cid w16 w16cex w16sdtdh wp14">
+  <w:endnote w:type="separator" w:id="-1">
+    <w:p>
+      <w:r>
+        <w:separator/>
+      </w:r>
+    </w:p>
+  </w:endnote>
+  <w:endnote w:type="continuationSeparator" w:id="0">
+    <w:p>
+      <w:r>
+        <w:continuationSeparator/>
+      </w:r>
+    </w:p>
+  </w:endnote>
+</w:endnotes>
+</file>
+
 <file path=word/footer1.xml><?xml version="1.0" encoding="utf-8"?>
-<w:ftr xmlns:wp14="http://schemas.microsoft.com/office/word/2010/wordprocessingDrawing" xmlns:mc="http://schemas.openxmlformats.org/markup-compatibility/2006" xmlns:ve="http://schemas.openxmlformats.org/markup-compatibility/2006" xmlns:o="urn:schemas-microsoft-com:office:office" xmlns:r="http://schemas.openxmlformats.org/officeDocument/2006/relationships" xmlns:m="http://schemas.openxmlformats.org/officeDocument/2006/math" xmlns:v="urn:schemas-microsoft-com:vml" xmlns:wp="http://schemas.openxmlformats.org/drawingml/2006/wordprocessingDrawing" xmlns:w10="urn:schemas-microsoft-com:office:word" xmlns:w="http://schemas.openxmlformats.org/wordprocessingml/2006/main" xmlns:wne="http://schemas.microsoft.com/office/word/2006/wordml" xmlns:a="http://schemas.openxmlformats.org/drawingml/2006/main" xmlns:pic="http://schemas.openxmlformats.org/drawingml/2006/picture" xmlns:wpg="http://schemas.microsoft.com/office/word/2010/wordprocessingGroup" xmlns:wps="http://schemas.microsoft.com/office/word/2010/wordprocessingShape" xmlns:w14="http://schemas.microsoft.com/office/word/2010/wordml" mc:Ignorable="w14 wp14" xml:space="preserve">
-  <w:p xmlns:wp14="http://schemas.microsoft.com/office/word/2010/wordml" wp14:textId="77777777">
+<w:ftr xmlns:wpc="http://schemas.microsoft.com/office/word/2010/wordprocessingCanvas" xmlns:cx="http://schemas.microsoft.com/office/drawing/2014/chartex" xmlns:cx1="http://schemas.microsoft.com/office/drawing/2015/9/8/chartex" xmlns:cx2="http://schemas.microsoft.com/office/drawing/2015/10/21/chartex" xmlns:cx3="http://schemas.microsoft.com/office/drawing/2016/5/9/chartex" xmlns:cx4="http://schemas.microsoft.com/office/drawing/2016/5/10/chartex" xmlns:cx5="http://schemas.microsoft.com/office/drawing/2016/5/11/chartex" xmlns:cx6="http://schemas.microsoft.com/office/drawing/2016/5/12/chartex" xmlns:cx7="http://schemas.microsoft.com/office/drawing/2016/5/13/chartex" xmlns:cx8="http://schemas.microsoft.com/office/drawing/2016/5/14/chartex" xmlns:mc="http://schemas.openxmlformats.org/markup-compatibility/2006" xmlns:aink="http://schemas.microsoft.com/office/drawing/2016/ink" xmlns:am3d="http://schemas.microsoft.com/office/drawing/2017/model3d" xmlns:o="urn:schemas-microsoft-com:office:office" xmlns:oel="http://schemas.microsoft.com/office/2019/extlst" xmlns:r="http://schemas.openxmlformats.org/officeDocument/2006/relationships" xmlns:m="http://schemas.openxmlformats.org/officeDocument/2006/math" xmlns:v="urn:schemas-microsoft-com:vml" xmlns:wp14="http://schemas.microsoft.com/office/word/2010/wordprocessingDrawing" xmlns:wp="http://schemas.openxmlformats.org/drawingml/2006/wordprocessingDrawing" xmlns:w10="urn:schemas-microsoft-com:office:word" xmlns:w="http://schemas.openxmlformats.org/wordprocessingml/2006/main" xmlns:w14="http://schemas.microsoft.com/office/word/2010/wordml" xmlns:w15="http://schemas.microsoft.com/office/word/2012/wordml" xmlns:w16cex="http://schemas.microsoft.com/office/word/2018/wordml/cex" xmlns:w16cid="http://schemas.microsoft.com/office/word/2016/wordml/cid" xmlns:w16="http://schemas.microsoft.com/office/word/2018/wordml" xmlns:w16sdtdh="http://schemas.microsoft.com/office/word/2020/wordml/sdtdatahash" xmlns:w16se="http://schemas.microsoft.com/office/word/2015/wordml/symex" xmlns:wpg="http://schemas.microsoft.com/office/word/2010/wordprocessingGroup" xmlns:wpi="http://schemas.microsoft.com/office/word/2010/wordprocessingInk" xmlns:wne="http://schemas.microsoft.com/office/word/2006/wordml" xmlns:wps="http://schemas.microsoft.com/office/word/2010/wordprocessingShape" mc:Ignorable="w14 w15 w16se w16cid w16 w16cex w16sdtdh wp14">
+  <w:p>
     <w:pPr>
       <w:pStyle w:val="BodyText"/>
       <w:spacing w:before="0" w:line="14" w:lineRule="auto"/>
@@ -357,12 +441,13 @@
     </w:pPr>
     <w:r>
       <w:rPr>
+        <w:noProof/>
         <w:sz w:val="20"/>
       </w:rPr>
       <mc:AlternateContent>
         <mc:Choice Requires="wps">
           <w:drawing>
-            <wp:anchor xmlns:wp14="http://schemas.microsoft.com/office/word/2010/wordprocessingDrawing" distT="0" distB="0" distL="0" distR="0" simplePos="0" relativeHeight="487519232" behindDoc="1" locked="0" layoutInCell="1" allowOverlap="1" wp14:anchorId="25573CC8" wp14:editId="7777777">
+            <wp:anchor distT="0" distB="0" distL="0" distR="0" simplePos="0" relativeHeight="487519232" behindDoc="1" locked="0" layoutInCell="1" allowOverlap="1" wp14:anchorId="0DDFB652" wp14:editId="5A62120C">
               <wp:simplePos x="0" y="0"/>
               <wp:positionH relativeFrom="page">
                 <wp:posOffset>0</wp:posOffset>
@@ -375,13 +460,14 @@
               <wp:wrapNone/>
               <wp:docPr id="1" name="Graphic 1"/>
               <wp:cNvGraphicFramePr>
-                <a:graphicFrameLocks/>
+                <a:graphicFrameLocks xmlns:a="http://schemas.openxmlformats.org/drawingml/2006/main"/>
               </wp:cNvGraphicFramePr>
-              <a:graphic>
+              <a:graphic xmlns:a="http://schemas.openxmlformats.org/drawingml/2006/main">
                 <a:graphicData uri="http://schemas.microsoft.com/office/word/2010/wordprocessingShape">
                   <wps:wsp>
-                    <wps:cNvPr id="1" name="Graphic 1"/>
-                    <wps:cNvSpPr/>
+                    <wps:cNvSpPr>
+                      <a:spLocks/>
+                    </wps:cNvSpPr>
                     <wps:spPr>
                       <a:xfrm>
                         <a:off x="0" y="0"/>
@@ -431,23 +517,24 @@
           </w:drawing>
         </mc:Choice>
         <mc:Fallback>
-          <w:pict w14:anchorId="57215920">
-            <v:rect id="docshape1" style="position:absolute;margin-left:0pt;margin-top:776.249939pt;width:595.499957pt;height:.75pt;mso-position-horizontal-relative:page;mso-position-vertical-relative:page;z-index:-15797248" filled="true" fillcolor="#d5e2ed" stroked="false">
-              <v:fill type="solid"/>
-              <w10:wrap type="none"/>
-            </v:rect>
+          <w:pict>
+            <v:shape w14:anchorId="68C0751D" id="Graphic 1" o:spid="_x0000_s1026" style="position:absolute;margin-left:0;margin-top:776.25pt;width:595.5pt;height:.75pt;z-index:-15797248;visibility:visible;mso-wrap-style:square;mso-wrap-distance-left:0;mso-wrap-distance-top:0;mso-wrap-distance-right:0;mso-wrap-distance-bottom:0;mso-position-horizontal:absolute;mso-position-horizontal-relative:page;mso-position-vertical:absolute;mso-position-vertical-relative:page;v-text-anchor:top" coordsize="7562850,9525" o:gfxdata="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" path="m7562849,9524l,9524,,,7562849,r,9524xe" fillcolor="#d5e2ed" stroked="f">
+              <v:path arrowok="t"/>
+              <w10:wrap anchorx="page" anchory="page"/>
+            </v:shape>
           </w:pict>
         </mc:Fallback>
       </mc:AlternateContent>
     </w:r>
     <w:r>
       <w:rPr>
+        <w:noProof/>
         <w:sz w:val="20"/>
       </w:rPr>
       <mc:AlternateContent>
         <mc:Choice Requires="wps">
           <w:drawing>
-            <wp:anchor xmlns:wp14="http://schemas.microsoft.com/office/word/2010/wordprocessingDrawing" distT="0" distB="0" distL="0" distR="0" simplePos="0" relativeHeight="487519744" behindDoc="1" locked="0" layoutInCell="1" allowOverlap="1" wp14:anchorId="490A02E4" wp14:editId="7777777">
+            <wp:anchor distT="0" distB="0" distL="0" distR="0" simplePos="0" relativeHeight="487519744" behindDoc="1" locked="0" layoutInCell="1" allowOverlap="1" wp14:anchorId="7F5B4147" wp14:editId="6AE448B6">
               <wp:simplePos x="0" y="0"/>
               <wp:positionH relativeFrom="page">
                 <wp:posOffset>491232</wp:posOffset>
@@ -460,13 +547,14 @@
               <wp:wrapNone/>
               <wp:docPr id="2" name="Textbox 2"/>
               <wp:cNvGraphicFramePr>
-                <a:graphicFrameLocks/>
+                <a:graphicFrameLocks xmlns:a="http://schemas.openxmlformats.org/drawingml/2006/main"/>
               </wp:cNvGraphicFramePr>
-              <a:graphic>
+              <a:graphic xmlns:a="http://schemas.openxmlformats.org/drawingml/2006/main">
                 <a:graphicData uri="http://schemas.microsoft.com/office/word/2010/wordprocessingShape">
                   <wps:wsp>
-                    <wps:cNvPr id="2" name="Textbox 2"/>
-                    <wps:cNvSpPr txBox="1"/>
+                    <wps:cNvSpPr txBox="1">
+                      <a:spLocks/>
+                    </wps:cNvSpPr>
                     <wps:spPr>
                       <a:xfrm>
                         <a:off x="0" y="0"/>
@@ -478,11 +566,10 @@
                     </wps:spPr>
                     <wps:txbx>
                       <w:txbxContent>
-                        <w:p xmlns:wp14="http://schemas.microsoft.com/office/word/2010/wordml" wp14:textId="77777777">
+                        <w:p>
                           <w:pPr>
                             <w:spacing w:before="20"/>
-                            <w:ind w:left="20" w:right="0" w:firstLine="0"/>
-                            <w:jc w:val="left"/>
+                            <w:ind w:left="20"/>
                             <w:rPr>
                               <w:rFonts w:ascii="Arial"/>
                               <w:b/>
@@ -508,7 +595,7 @@
                               <w:w w:val="105"/>
                               <w:sz w:val="13"/>
                             </w:rPr>
-                            <w:t> </w:t>
+                            <w:t xml:space="preserve"> </w:t>
                           </w:r>
                           <w:r>
                             <w:rPr>
@@ -529,7 +616,7 @@
                               <w:w w:val="105"/>
                               <w:sz w:val="13"/>
                             </w:rPr>
-                            <w:t> </w:t>
+                            <w:t xml:space="preserve"> </w:t>
                           </w:r>
                           <w:r>
                             <w:rPr>
@@ -550,7 +637,7 @@
                               <w:w w:val="105"/>
                               <w:sz w:val="13"/>
                             </w:rPr>
-                            <w:t> </w:t>
+                            <w:t xml:space="preserve"> </w:t>
                           </w:r>
                           <w:r>
                             <w:rPr>
@@ -576,19 +663,18 @@
           </w:drawing>
         </mc:Choice>
         <mc:Fallback>
-          <w:pict w14:anchorId="3D4E2DC7">
-            <v:shapetype id="_x0000_t202" coordsize="21600,21600" o:spt="202" path="m,l,21600r21600,l21600,xe">
+          <w:pict>
+            <v:shapetype w14:anchorId="7F5B4147" id="_x0000_t202" coordsize="21600,21600" o:spt="202" path="m,l,21600r21600,l21600,xe">
               <v:stroke joinstyle="miter"/>
               <v:path gradientshapeok="t" o:connecttype="rect"/>
             </v:shapetype>
-            <v:shape id="docshape2" style="position:absolute;margin-left:38.679688pt;margin-top:796.889404pt;width:74.4pt;height:9.550pt;mso-position-horizontal-relative:page;mso-position-vertical-relative:page;z-index:-15796736" filled="false" stroked="false" type="#_x0000_t202">
+            <v:shape id="Textbox 2" o:spid="_x0000_s1026" type="#_x0000_t202" style="position:absolute;margin-left:38.7pt;margin-top:796.9pt;width:74.4pt;height:9.55pt;z-index:-15796736;visibility:visible;mso-wrap-style:square;mso-wrap-distance-left:0;mso-wrap-distance-top:0;mso-wrap-distance-right:0;mso-wrap-distance-bottom:0;mso-position-horizontal:absolute;mso-position-horizontal-relative:page;mso-position-vertical:absolute;mso-position-vertical-relative:page;v-text-anchor:top" o:gfxdata="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" filled="f" stroked="f">
               <v:textbox inset="0,0,0,0">
                 <w:txbxContent>
-                  <w:p wp14:textId="77777777">
+                  <w:p>
                     <w:pPr>
                       <w:spacing w:before="20"/>
-                      <w:ind w:left="20" w:right="0" w:firstLine="0"/>
-                      <w:jc w:val="left"/>
+                      <w:ind w:left="20"/>
                       <w:rPr>
                         <w:rFonts w:ascii="Arial"/>
                         <w:b/>
@@ -614,7 +700,7 @@
                         <w:w w:val="105"/>
                         <w:sz w:val="13"/>
                       </w:rPr>
-                      <w:t> </w:t>
+                      <w:t xml:space="preserve"> </w:t>
                     </w:r>
                     <w:r>
                       <w:rPr>
@@ -635,7 +721,7 @@
                         <w:w w:val="105"/>
                         <w:sz w:val="13"/>
                       </w:rPr>
-                      <w:t> </w:t>
+                      <w:t xml:space="preserve"> </w:t>
                     </w:r>
                     <w:r>
                       <w:rPr>
@@ -656,7 +742,7 @@
                         <w:w w:val="105"/>
                         <w:sz w:val="13"/>
                       </w:rPr>
-                      <w:t> </w:t>
+                      <w:t xml:space="preserve"> </w:t>
                     </w:r>
                     <w:r>
                       <w:rPr>
@@ -672,7 +758,7 @@
                   </w:p>
                 </w:txbxContent>
               </v:textbox>
-              <w10:wrap type="none"/>
+              <w10:wrap anchorx="page" anchory="page"/>
             </v:shape>
           </w:pict>
         </mc:Fallback>
@@ -682,9 +768,28 @@
 </w:ftr>
 </file>
 
+<file path=word/footnotes.xml><?xml version="1.0" encoding="utf-8"?>
+<w:footnotes xmlns:wpc="http://schemas.microsoft.com/office/word/2010/wordprocessingCanvas" xmlns:cx="http://schemas.microsoft.com/office/drawing/2014/chartex" xmlns:cx1="http://schemas.microsoft.com/office/drawing/2015/9/8/chartex" xmlns:cx2="http://schemas.microsoft.com/office/drawing/2015/10/21/chartex" xmlns:cx3="http://schemas.microsoft.com/office/drawing/2016/5/9/chartex" xmlns:cx4="http://schemas.microsoft.com/office/drawing/2016/5/10/chartex" xmlns:cx5="http://schemas.microsoft.com/office/drawing/2016/5/11/chartex" xmlns:cx6="http://schemas.microsoft.com/office/drawing/2016/5/12/chartex" xmlns:cx7="http://schemas.microsoft.com/office/drawing/2016/5/13/chartex" xmlns:cx8="http://schemas.microsoft.com/office/drawing/2016/5/14/chartex" xmlns:mc="http://schemas.openxmlformats.org/markup-compatibility/2006" xmlns:aink="http://schemas.microsoft.com/office/drawing/2016/ink" xmlns:am3d="http://schemas.microsoft.com/office/drawing/2017/model3d" xmlns:o="urn:schemas-microsoft-com:office:office" xmlns:oel="http://schemas.microsoft.com/office/2019/extlst" xmlns:r="http://schemas.openxmlformats.org/officeDocument/2006/relationships" xmlns:m="http://schemas.openxmlformats.org/officeDocument/2006/math" xmlns:v="urn:schemas-microsoft-com:vml" xmlns:wp14="http://schemas.microsoft.com/office/word/2010/wordprocessingDrawing" xmlns:wp="http://schemas.openxmlformats.org/drawingml/2006/wordprocessingDrawing" xmlns:w10="urn:schemas-microsoft-com:office:word" xmlns:w="http://schemas.openxmlformats.org/wordprocessingml/2006/main" xmlns:w14="http://schemas.microsoft.com/office/word/2010/wordml" xmlns:w15="http://schemas.microsoft.com/office/word/2012/wordml" xmlns:w16cex="http://schemas.microsoft.com/office/word/2018/wordml/cex" xmlns:w16cid="http://schemas.microsoft.com/office/word/2016/wordml/cid" xmlns:w16="http://schemas.microsoft.com/office/word/2018/wordml" xmlns:w16sdtdh="http://schemas.microsoft.com/office/word/2020/wordml/sdtdatahash" xmlns:w16se="http://schemas.microsoft.com/office/word/2015/wordml/symex" xmlns:wpg="http://schemas.microsoft.com/office/word/2010/wordprocessingGroup" xmlns:wpi="http://schemas.microsoft.com/office/word/2010/wordprocessingInk" xmlns:wne="http://schemas.microsoft.com/office/word/2006/wordml" xmlns:wps="http://schemas.microsoft.com/office/word/2010/wordprocessingShape" mc:Ignorable="w14 w15 w16se w16cid w16 w16cex w16sdtdh wp14">
+  <w:footnote w:type="separator" w:id="-1">
+    <w:p>
+      <w:r>
+        <w:separator/>
+      </w:r>
+    </w:p>
+  </w:footnote>
+  <w:footnote w:type="continuationSeparator" w:id="0">
+    <w:p>
+      <w:r>
+        <w:continuationSeparator/>
+      </w:r>
+    </w:p>
+  </w:footnote>
+</w:footnotes>
+</file>
+
 <file path=word/header1.xml><?xml version="1.0" encoding="utf-8"?>
-<w:hdr xmlns:w="http://schemas.openxmlformats.org/wordprocessingml/2006/main" xmlns:r="http://schemas.openxmlformats.org/officeDocument/2006/relationships" xmlns:mc="http://schemas.openxmlformats.org/markup-compatibility/2006" xmlns:v="urn:schemas-microsoft-com:vml" xmlns:o="urn:schemas-microsoft-com:office:office" xmlns:ve="http://schemas.openxmlformats.org/markup-compatibility/2006" xmlns:w10="urn:schemas-microsoft-com:office:word" xmlns:a="http://schemas.openxmlformats.org/drawingml/2006/main" xmlns:a14="http://schemas.microsoft.com/office/drawing/2010/main" xmlns:pic="http://schemas.openxmlformats.org/drawingml/2006/picture" xmlns:wp="http://schemas.openxmlformats.org/drawingml/2006/wordprocessingDrawing" xmlns:wp14="http://schemas.microsoft.com/office/word/2010/wordprocessingDrawing" xmlns:wps="http://schemas.microsoft.com/office/word/2010/wordprocessingShape" xmlns:wpg="http://schemas.microsoft.com/office/word/2010/wordprocessingGroup" xmlns:w14="http://schemas.microsoft.com/office/word/2010/wordml" mc:Ignorable="w14 wp14">
-  <w:p xmlns:wp14="http://schemas.microsoft.com/office/word/2010/wordml" wp14:textId="23C320DF">
+<w:hdr xmlns:wpc="http://schemas.microsoft.com/office/word/2010/wordprocessingCanvas" xmlns:cx="http://schemas.microsoft.com/office/drawing/2014/chartex" xmlns:cx1="http://schemas.microsoft.com/office/drawing/2015/9/8/chartex" xmlns:cx2="http://schemas.microsoft.com/office/drawing/2015/10/21/chartex" xmlns:cx3="http://schemas.microsoft.com/office/drawing/2016/5/9/chartex" xmlns:cx4="http://schemas.microsoft.com/office/drawing/2016/5/10/chartex" xmlns:cx5="http://schemas.microsoft.com/office/drawing/2016/5/11/chartex" xmlns:cx6="http://schemas.microsoft.com/office/drawing/2016/5/12/chartex" xmlns:cx7="http://schemas.microsoft.com/office/drawing/2016/5/13/chartex" xmlns:cx8="http://schemas.microsoft.com/office/drawing/2016/5/14/chartex" xmlns:mc="http://schemas.openxmlformats.org/markup-compatibility/2006" xmlns:aink="http://schemas.microsoft.com/office/drawing/2016/ink" xmlns:am3d="http://schemas.microsoft.com/office/drawing/2017/model3d" xmlns:o="urn:schemas-microsoft-com:office:office" xmlns:oel="http://schemas.microsoft.com/office/2019/extlst" xmlns:r="http://schemas.openxmlformats.org/officeDocument/2006/relationships" xmlns:m="http://schemas.openxmlformats.org/officeDocument/2006/math" xmlns:v="urn:schemas-microsoft-com:vml" xmlns:wp14="http://schemas.microsoft.com/office/word/2010/wordprocessingDrawing" xmlns:wp="http://schemas.openxmlformats.org/drawingml/2006/wordprocessingDrawing" xmlns:w10="urn:schemas-microsoft-com:office:word" xmlns:w="http://schemas.openxmlformats.org/wordprocessingml/2006/main" xmlns:w14="http://schemas.microsoft.com/office/word/2010/wordml" xmlns:w15="http://schemas.microsoft.com/office/word/2012/wordml" xmlns:w16cex="http://schemas.microsoft.com/office/word/2018/wordml/cex" xmlns:w16cid="http://schemas.microsoft.com/office/word/2016/wordml/cid" xmlns:w16="http://schemas.microsoft.com/office/word/2018/wordml" xmlns:w16sdtdh="http://schemas.microsoft.com/office/word/2020/wordml/sdtdatahash" xmlns:w16se="http://schemas.microsoft.com/office/word/2015/wordml/symex" xmlns:wpg="http://schemas.microsoft.com/office/word/2010/wordprocessingGroup" xmlns:wpi="http://schemas.microsoft.com/office/word/2010/wordprocessingInk" xmlns:wne="http://schemas.microsoft.com/office/word/2006/wordml" xmlns:wps="http://schemas.microsoft.com/office/word/2010/wordprocessingShape" mc:Ignorable="w14 w15 w16se w16cid w16 w16cex w16sdtdh wp14">
+  <w:p>
     <w:pPr>
       <w:pStyle w:val="BodyText"/>
       <w:spacing w:before="0"/>
@@ -698,12 +803,77 @@
     <w:r>
       <w:rPr>
         <w:rFonts w:ascii="Times New Roman"/>
+        <w:noProof/>
+        <w:sz w:val="36"/>
+        <w:szCs w:val="36"/>
+      </w:rPr>
+      <w:drawing>
+        <wp:anchor distT="0" distB="0" distL="114300" distR="114300" simplePos="0" relativeHeight="251658752" behindDoc="1" locked="0" layoutInCell="1" allowOverlap="1" wp14:anchorId="20069870" wp14:editId="133865ED">
+          <wp:simplePos x="0" y="0"/>
+          <wp:positionH relativeFrom="column">
+            <wp:posOffset>744220</wp:posOffset>
+          </wp:positionH>
+          <wp:positionV relativeFrom="paragraph">
+            <wp:posOffset>3670300</wp:posOffset>
+          </wp:positionV>
+          <wp:extent cx="5143500" cy="3320456"/>
+          <wp:effectExtent l="0" t="0" r="0" b="0"/>
+          <wp:wrapNone/>
+          <wp:docPr id="9" name="Picture 9"/>
+          <wp:cNvGraphicFramePr>
+            <a:graphicFrameLocks xmlns:a="http://schemas.openxmlformats.org/drawingml/2006/main" noChangeAspect="1"/>
+          </wp:cNvGraphicFramePr>
+          <a:graphic xmlns:a="http://schemas.openxmlformats.org/drawingml/2006/main">
+            <a:graphicData uri="http://schemas.openxmlformats.org/drawingml/2006/picture">
+              <pic:pic xmlns:pic="http://schemas.openxmlformats.org/drawingml/2006/picture">
+                <pic:nvPicPr>
+                  <pic:cNvPr id="9" name="Picture 9"/>
+                  <pic:cNvPicPr/>
+                </pic:nvPicPr>
+                <pic:blipFill>
+                  <a:blip r:embed="rId1">
+                    <a:alphaModFix amt="35000"/>
+                    <a:extLst>
+                      <a:ext uri="{28A0092B-C50C-407E-A947-70E740481C1C}">
+                        <a14:useLocalDpi xmlns:a14="http://schemas.microsoft.com/office/drawing/2010/main" val="0"/>
+                      </a:ext>
+                    </a:extLst>
+                  </a:blip>
+                  <a:stretch>
+                    <a:fillRect/>
+                  </a:stretch>
+                </pic:blipFill>
+                <pic:spPr>
+                  <a:xfrm>
+                    <a:off x="0" y="0"/>
+                    <a:ext cx="5143500" cy="3320456"/>
+                  </a:xfrm>
+                  <a:prstGeom prst="rect">
+                    <a:avLst/>
+                  </a:prstGeom>
+                </pic:spPr>
+              </pic:pic>
+            </a:graphicData>
+          </a:graphic>
+          <wp14:sizeRelH relativeFrom="page">
+            <wp14:pctWidth>0</wp14:pctWidth>
+          </wp14:sizeRelH>
+          <wp14:sizeRelV relativeFrom="page">
+            <wp14:pctHeight>0</wp14:pctHeight>
+          </wp14:sizeRelV>
+        </wp:anchor>
+      </w:drawing>
+    </w:r>
+    <w:r>
+      <w:rPr>
+        <w:rFonts w:ascii="Times New Roman"/>
+        <w:noProof/>
         <w:sz w:val="36"/>
       </w:rPr>
       <mc:AlternateContent>
-        <mc:Choice Requires="wps">
+        <mc:Choice Requires="wpg">
           <w:drawing>
-            <wp:anchor xmlns:wp14="http://schemas.microsoft.com/office/word/2010/wordprocessingDrawing" distT="0" distB="0" distL="0" distR="0" simplePos="0" relativeHeight="15729152" behindDoc="0" locked="0" layoutInCell="1" allowOverlap="1" wp14:anchorId="4864D213" wp14:editId="7777777">
+            <wp:anchor distT="0" distB="0" distL="0" distR="0" simplePos="0" relativeHeight="251655680" behindDoc="0" locked="0" layoutInCell="1" allowOverlap="1" wp14:anchorId="2F713A13" wp14:editId="01E4D706">
               <wp:simplePos x="0" y="0"/>
               <wp:positionH relativeFrom="page">
                 <wp:posOffset>190</wp:posOffset>
@@ -716,27 +886,29 @@
               <wp:wrapNone/>
               <wp:docPr id="3" name="Group 3"/>
               <wp:cNvGraphicFramePr>
-                <a:graphicFrameLocks/>
+                <a:graphicFrameLocks xmlns:a="http://schemas.openxmlformats.org/drawingml/2006/main"/>
               </wp:cNvGraphicFramePr>
-              <a:graphic>
+              <a:graphic xmlns:a="http://schemas.openxmlformats.org/drawingml/2006/main">
                 <a:graphicData uri="http://schemas.microsoft.com/office/word/2010/wordprocessingGroup">
                   <wpg:wgp>
-                    <wpg:cNvPr id="3" name="Group 3"/>
-                    <wpg:cNvGrpSpPr/>
+                    <wpg:cNvGrpSpPr>
+                      <a:grpSpLocks/>
+                    </wpg:cNvGrpSpPr>
                     <wpg:grpSpPr>
                       <a:xfrm>
                         <a:off x="0" y="0"/>
                         <a:ext cx="7562850" cy="622935"/>
+                        <a:chOff x="0" y="0"/>
                         <a:chExt cx="7562850" cy="622935"/>
                       </a:xfrm>
                     </wpg:grpSpPr>
-                    <pic:pic>
+                    <pic:pic xmlns:pic="http://schemas.openxmlformats.org/drawingml/2006/picture">
                       <pic:nvPicPr>
                         <pic:cNvPr id="4" name="Image 4"/>
                         <pic:cNvPicPr/>
                       </pic:nvPicPr>
                       <pic:blipFill>
-                        <a:blip r:embed="rId1" cstate="print"/>
+                        <a:blip r:embed="rId2" cstate="print"/>
                         <a:stretch>
                           <a:fillRect/>
                         </a:stretch>
@@ -833,13 +1005,13 @@
                         <a:noAutofit/>
                       </wps:bodyPr>
                     </wps:wsp>
-                    <pic:pic>
+                    <pic:pic xmlns:pic="http://schemas.openxmlformats.org/drawingml/2006/picture">
                       <pic:nvPicPr>
                         <pic:cNvPr id="6" name="Image 6"/>
                         <pic:cNvPicPr/>
                       </pic:nvPicPr>
                       <pic:blipFill>
-                        <a:blip r:embed="rId2" cstate="print"/>
+                        <a:blip r:embed="rId3" cstate="print"/>
                         <a:stretch>
                           <a:fillRect/>
                         </a:stretch>
@@ -1071,13 +1243,13 @@
                         <a:noAutofit/>
                       </wps:bodyPr>
                     </wps:wsp>
-                    <pic:pic>
+                    <pic:pic xmlns:pic="http://schemas.openxmlformats.org/drawingml/2006/picture">
                       <pic:nvPicPr>
                         <pic:cNvPr id="8" name="Image 8"/>
                         <pic:cNvPicPr/>
                       </pic:nvPicPr>
                       <pic:blipFill>
-                        <a:blip r:embed="rId3" cstate="print"/>
+                        <a:blip r:embed="rId4" cstate="print"/>
                         <a:stretch>
                           <a:fillRect/>
                         </a:stretch>
@@ -1099,97 +1271,57 @@
           </w:drawing>
         </mc:Choice>
         <mc:Fallback>
-          <w:pict w14:anchorId="4BEC1E72">
-            <v:group id="docshapegroup3" style="position:absolute;margin-left:.014997pt;margin-top:18.825516pt;width:595.5pt;height:49.05pt;mso-position-horizontal-relative:page;mso-position-vertical-relative:page;z-index:15729152" coordsize="11910,981" coordorigin="0,377">
-              <v:shape id="docshape4" style="position:absolute;left:0;top:617;width:11910;height:499" stroked="false" type="#_x0000_t75">
-                <v:imagedata o:title="" r:id="rId1"/>
+          <w:pict>
+            <v:group w14:anchorId="459BF07C" id="Group 3" o:spid="_x0000_s1026" style="position:absolute;margin-left:0;margin-top:18.85pt;width:595.5pt;height:49.05pt;z-index:251655680;mso-wrap-distance-left:0;mso-wrap-distance-right:0;mso-position-horizontal-relative:page;mso-position-vertical-relative:page" coordsize="75628,6229" o:gfxdata="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">
+              <v:shapetype id="_x0000_t75" coordsize="21600,21600" o:spt="75" o:preferrelative="t" path="m@4@5l@4@11@9@11@9@5xe" filled="f" stroked="f">
+                <v:stroke joinstyle="miter"/>
+                <v:formulas>
+                  <v:f eqn="if lineDrawn pixelLineWidth 0"/>
+                  <v:f eqn="sum @0 1 0"/>
+                  <v:f eqn="sum 0 0 @1"/>
+                  <v:f eqn="prod @2 1 2"/>
+                  <v:f eqn="prod @3 21600 pixelWidth"/>
+                  <v:f eqn="prod @3 21600 pixelHeight"/>
+                  <v:f eqn="sum @0 0 1"/>
+                  <v:f eqn="prod @6 1 2"/>
+                  <v:f eqn="prod @7 21600 pixelWidth"/>
+                  <v:f eqn="sum @8 21600 0"/>
+                  <v:f eqn="prod @7 21600 pixelHeight"/>
+                  <v:f eqn="sum @10 21600 0"/>
+                </v:formulas>
+                <v:path o:extrusionok="f" gradientshapeok="t" o:connecttype="rect"/>
+                <o:lock v:ext="edit" aspectratio="t"/>
+              </v:shapetype>
+              <v:shape id="Image 4" o:spid="_x0000_s1027" type="#_x0000_t75" style="position:absolute;top:1531;width:75626;height:3166;visibility:visible;mso-wrap-style:square" o:gfxdata="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">
+                <v:imagedata r:id="rId5" o:title=""/>
               </v:shape>
-              <v:shape id="docshape5" style="position:absolute;left:681;top:742;width:9650;height:250" coordsize="9650,250" coordorigin="681,742" filled="true" fillcolor="#1f5e9e" stroked="false" path="m10206,992l798,992,730,966,688,907,681,859,685,834,724,773,790,743,806,742,10214,742,10282,768,10324,827,10331,875,10327,899,10288,961,10222,991,10206,992xe">
+              <v:shape id="Graphic 5" o:spid="_x0000_s1028" style="position:absolute;left:4323;top:2321;width:61277;height:1588;visibility:visible;mso-wrap-style:square;v-text-anchor:top" coordsize="6127750,158750" o:gfxdata="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" path="m6048190,158373r-5974100,l30912,142139,4043,104686,,73987,2539,58638,26907,19516,68933,507,79296,,6053397,r43177,16234l6123443,53687r4043,30699l6124947,99735r-24367,39122l6058553,157866r-10363,507xe" fillcolor="#1f5e9e" stroked="f">
                 <v:path arrowok="t"/>
-                <v:fill type="solid"/>
               </v:shape>
-              <v:shape id="docshape6" style="position:absolute;left:9876;top:413;width:1590;height:907" stroked="false" type="#_x0000_t75">
-                <v:imagedata o:title="" r:id="rId2"/>
+              <v:shape id="Image 6" o:spid="_x0000_s1029" type="#_x0000_t75" style="position:absolute;left:62716;top:237;width:10091;height:5755;visibility:visible;mso-wrap-style:square" o:gfxdata="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">
+                <v:imagedata r:id="rId6" o:title=""/>
               </v:shape>
-              <v:shape id="docshape7" style="position:absolute;left:9876;top:413;width:1590;height:907" coordsize="1590,907" coordorigin="9877,413" filled="false" stroked="true" strokecolor="#0a2e78" strokeweight="3.68569pt" path="m11466,867l11457,933,11432,998,11398,1051,11353,1100,11298,1146,11247,1180,11190,1210,11129,1238,11063,1261,10993,1281,10921,1297,10845,1309,10769,1317,10691,1320,10671,1320,10652,1320,10574,1317,10497,1309,10422,1297,10349,1281,10280,1261,10214,1238,10152,1210,10096,1180,10045,1146,9990,1100,9945,1051,9911,998,9885,933,9877,867,9877,856,9888,789,9917,725,9953,673,10000,624,10057,579,10109,546,10167,516,10230,490,10297,467,10367,448,10441,433,10516,422,10593,416,10671,413,10691,414,10769,417,10845,424,10921,436,10993,452,11063,472,11129,496,11190,523,11247,554,11298,588,11353,634,11398,683,11432,735,11457,800,11466,867xe">
+              <v:shape id="Graphic 7" o:spid="_x0000_s1030" style="position:absolute;left:62714;top:234;width:10097;height:5759;visibility:visible;mso-wrap-style:square;v-text-anchor:top" coordsize="1009650,575945" o:gfxdata="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" path="m1009233,287952r-5462,42252l987504,371540r-21565,33104l937440,435989r-35009,29119l870086,486506r-35865,19485l795182,523377r-41838,15118l709111,551200r-46203,10171l615182,568908r-48792,4831l517004,575818r-12388,87l492229,575818r-49387,-2079l394050,568908r-47727,-7537l300120,551200,255887,538495,214049,523377,175010,505991,139146,486506,106800,465108,71791,435989,43291,404644,21728,371540,5460,330204,,287952r151,-7069l7427,238725,25469,197625,48447,164836,78286,133900r36256,-28623l147797,84339,184490,65362,224265,48528,266741,34001,311507,21919r46626,-9520l406170,5532,455155,1386,504616,r12388,86l566390,2165r48792,4831l662908,14534r46203,10170l753344,37409r41838,15119l834221,69913r35865,19486l902431,110796r35009,29119l965939,171260r21565,33104l1003771,245701r5462,42251xe" filled="f" strokecolor="#0a2e78" strokeweight="1.3002mm">
                 <v:path arrowok="t"/>
-                <v:stroke dashstyle="solid"/>
               </v:shape>
-              <v:shape id="docshape8" style="position:absolute;left:10260;top:540;width:825;height:705" stroked="false" type="#_x0000_t75">
-                <v:imagedata o:title="" r:id="rId3"/>
+              <v:shape id="Image 8" o:spid="_x0000_s1031" type="#_x0000_t75" style="position:absolute;left:65149;top:1038;width:5238;height:4476;visibility:visible;mso-wrap-style:square" o:gfxdata="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">
+                <v:imagedata r:id="rId7" o:title=""/>
               </v:shape>
-              <w10:wrap type="none"/>
+              <w10:wrap anchorx="page" anchory="page"/>
             </v:group>
           </w:pict>
         </mc:Fallback>
       </mc:AlternateContent>
-    </w:r>
-    <w:r>
-      <w:drawing>
-        <wp:anchor xmlns:wp14="http://schemas.microsoft.com/office/word/2010/wordprocessingDrawing" distT="0" distB="0" distL="114300" distR="114300" simplePos="0" relativeHeight="251658240" behindDoc="1" locked="0" layoutInCell="1" allowOverlap="1" wp14:anchorId="37B989FE" wp14:editId="1460B24B">
-          <wp:simplePos x="0" y="0"/>
-          <wp:positionH relativeFrom="column">
-            <wp:posOffset>771525</wp:posOffset>
-          </wp:positionH>
-          <wp:positionV relativeFrom="page">
-            <wp:posOffset>2724150</wp:posOffset>
-          </wp:positionV>
-          <wp:extent cx="5029200" cy="3274261"/>
-          <wp:effectExtent l="0" t="0" r="0" b="0"/>
-          <wp:wrapNone/>
-          <wp:docPr id="19012881" name="drawing"/>
-          <wp:cNvGraphicFramePr>
-            <a:graphicFrameLocks noChangeAspect="1"/>
-          </wp:cNvGraphicFramePr>
-          <a:graphic>
-            <a:graphicData xmlns:a="http://schemas.openxmlformats.org/drawingml/2006/main" uri="http://schemas.openxmlformats.org/drawingml/2006/picture">
-              <pic:pic xmlns:pic="http://schemas.openxmlformats.org/drawingml/2006/picture">
-                <pic:nvPicPr>
-                  <pic:cNvPr id="19012881" name="Picture 19012881"/>
-                  <pic:cNvPicPr/>
-                </pic:nvPicPr>
-                <pic:blipFill>
-                  <a:blip xmlns:r="http://schemas.openxmlformats.org/officeDocument/2006/relationships" r:embed="rId4">
-                    <a:extLst>
-                      <a:ext uri="{28A0092B-C50C-407E-A947-70E740481C1C}">
-                        <a14:useLocalDpi xmlns:a14="http://schemas.microsoft.com/office/drawing/2010/main"/>
-                      </a:ext>
-                    </a:extLst>
-                  </a:blip>
-                  <a:stretch>
-                    <a:fillRect/>
-                  </a:stretch>
-                </pic:blipFill>
-                <pic:spPr>
-                  <a:xfrm rot="0">
-                    <a:off x="0" y="0"/>
-                    <a:ext cx="5029200" cy="3274261"/>
-                  </a:xfrm>
-                  <a:prstGeom prst="rect">
-                    <a:avLst/>
-                  </a:prstGeom>
-                </pic:spPr>
-              </pic:pic>
-            </a:graphicData>
-          </a:graphic>
-          <wp14:sizeRelH relativeFrom="page">
-            <wp14:pctWidth>0</wp14:pctWidth>
-          </wp14:sizeRelH>
-          <wp14:sizeRelV relativeFrom="page">
-            <wp14:pctHeight>0</wp14:pctHeight>
-          </wp14:sizeRelV>
-        </wp:anchor>
-      </w:drawing>
     </w:r>
   </w:p>
 </w:hdr>
 </file>
 
 <file path=word/numbering.xml><?xml version="1.0" encoding="utf-8"?>
-<w:numbering xmlns:ve="http://schemas.openxmlformats.org/markup-compatibility/2006" xmlns:o="urn:schemas-microsoft-com:office:office" xmlns:r="http://schemas.openxmlformats.org/officeDocument/2006/relationships" xmlns:m="http://schemas.openxmlformats.org/officeDocument/2006/math" xmlns:v="urn:schemas-microsoft-com:vml" xmlns:wp="http://schemas.openxmlformats.org/drawingml/2006/wordprocessingDrawing" xmlns:w10="urn:schemas-microsoft-com:office:word" xmlns:w="http://schemas.openxmlformats.org/wordprocessingml/2006/main" xmlns:wne="http://schemas.microsoft.com/office/word/2006/wordml">
+<w:numbering xmlns:wpc="http://schemas.microsoft.com/office/word/2010/wordprocessingCanvas" xmlns:cx="http://schemas.microsoft.com/office/drawing/2014/chartex" xmlns:cx1="http://schemas.microsoft.com/office/drawing/2015/9/8/chartex" xmlns:cx2="http://schemas.microsoft.com/office/drawing/2015/10/21/chartex" xmlns:cx3="http://schemas.microsoft.com/office/drawing/2016/5/9/chartex" xmlns:cx4="http://schemas.microsoft.com/office/drawing/2016/5/10/chartex" xmlns:cx5="http://schemas.microsoft.com/office/drawing/2016/5/11/chartex" xmlns:cx6="http://schemas.microsoft.com/office/drawing/2016/5/12/chartex" xmlns:cx7="http://schemas.microsoft.com/office/drawing/2016/5/13/chartex" xmlns:cx8="http://schemas.microsoft.com/office/drawing/2016/5/14/chartex" xmlns:mc="http://schemas.openxmlformats.org/markup-compatibility/2006" xmlns:aink="http://schemas.microsoft.com/office/drawing/2016/ink" xmlns:am3d="http://schemas.microsoft.com/office/drawing/2017/model3d" xmlns:o="urn:schemas-microsoft-com:office:office" xmlns:oel="http://schemas.microsoft.com/office/2019/extlst" xmlns:r="http://schemas.openxmlformats.org/officeDocument/2006/relationships" xmlns:m="http://schemas.openxmlformats.org/officeDocument/2006/math" xmlns:v="urn:schemas-microsoft-com:vml" xmlns:wp14="http://schemas.microsoft.com/office/word/2010/wordprocessingDrawing" xmlns:wp="http://schemas.openxmlformats.org/drawingml/2006/wordprocessingDrawing" xmlns:w10="urn:schemas-microsoft-com:office:word" xmlns:w="http://schemas.openxmlformats.org/wordprocessingml/2006/main" xmlns:w14="http://schemas.microsoft.com/office/word/2010/wordml" xmlns:w15="http://schemas.microsoft.com/office/word/2012/wordml" xmlns:w16cex="http://schemas.microsoft.com/office/word/2018/wordml/cex" xmlns:w16cid="http://schemas.microsoft.com/office/word/2016/wordml/cid" xmlns:w16="http://schemas.microsoft.com/office/word/2018/wordml" xmlns:w16sdtdh="http://schemas.microsoft.com/office/word/2020/wordml/sdtdatahash" xmlns:w16se="http://schemas.microsoft.com/office/word/2015/wordml/symex" xmlns:wpg="http://schemas.microsoft.com/office/word/2010/wordprocessingGroup" xmlns:wpi="http://schemas.microsoft.com/office/word/2010/wordprocessingInk" xmlns:wne="http://schemas.microsoft.com/office/word/2006/wordml" xmlns:wps="http://schemas.microsoft.com/office/word/2010/wordprocessingShape" mc:Ignorable="w14 w15 w16se w16cid w16 w16cex w16sdtdh wp14">
   <w:numPicBullet w:numPicBulletId="0">
     <w:pict>
-      <v:shapetype id="_x0000_t75" coordsize="21600,21600" filled="f" stroked="f" o:spt="75" o:preferrelative="t" path="m@4@5l@4@11@9@11@9@5xe">
+      <v:shapetype id="_x0000_t75" coordsize="21600,21600" o:spt="75" o:preferrelative="t" path="m@4@5l@4@11@9@11@9@5xe" filled="f" stroked="f">
         <v:stroke joinstyle="miter"/>
         <v:formulas>
           <v:f eqn="if lineDrawn pixelLineWidth 0"/>
@@ -1205,19 +1337,19 @@
           <v:f eqn="prod @7 21600 pixelHeight"/>
           <v:f eqn="sum @10 21600 0"/>
         </v:formulas>
-        <v:path gradientshapeok="t" o:connecttype="rect" o:extrusionok="f"/>
+        <v:path o:extrusionok="f" gradientshapeok="t" o:connecttype="rect"/>
         <o:lock v:ext="edit" aspectratio="t"/>
       </v:shapetype>
-      <v:shape id="_x0000_i1075" style="width:4.500000pt;height:4.500000pt" o:bullet="t" type="#_x0000_t75">
-        <v:imagedata o:title="image4.png" r:id="rId1"/>
+      <v:shape id="_x0000_i1036" type="#_x0000_t75" style="width:4.5pt;height:4.5pt" o:bullet="t">
+        <v:imagedata r:id="rId1" o:title="image4"/>
       </v:shape>
     </w:pict>
   </w:numPicBullet>
-  <w:abstractNum w:abstractNumId="0">
-    <w:nsid w:val="d0cbc70"/>
+  <w:abstractNum w:abstractNumId="0" w15:restartNumberingAfterBreak="0">
+    <w:nsid w:val="0D0CBC70"/>
     <w:multiLevelType w:val="hybridMultilevel"/>
-    <w:lvl w:ilvl="0">
-      <w:start w:val="0"/>
+    <w:tmpl w:val="1EDE8B36"/>
+    <w:lvl w:ilvl="0" w:tplc="271E3026">
       <w:numFmt w:val="bullet"/>
       <w:lvlText w:val="&amp;"/>
       <w:lvlPicBulletId w:val="0"/>
@@ -1226,7 +1358,7 @@
         <w:ind w:left="355" w:hanging="194"/>
       </w:pPr>
       <w:rPr>
-        <w:rFonts w:hint="default" w:ascii="Times New Roman" w:hAnsi="Times New Roman" w:eastAsia="Times New Roman" w:cs="Times New Roman"/>
+        <w:rFonts w:ascii="Times New Roman" w:eastAsia="Times New Roman" w:hAnsi="Times New Roman" w:cs="Times New Roman" w:hint="default"/>
         <w:b w:val="0"/>
         <w:bCs w:val="0"/>
         <w:i w:val="0"/>
@@ -1238,8 +1370,7 @@
         <w:lang w:val="en-US" w:eastAsia="en-US" w:bidi="ar-SA"/>
       </w:rPr>
     </w:lvl>
-    <w:lvl w:ilvl="1">
-      <w:start w:val="0"/>
+    <w:lvl w:ilvl="1" w:tplc="66B6ED78">
       <w:numFmt w:val="bullet"/>
       <w:lvlText w:val="•"/>
       <w:lvlJc w:val="left"/>
@@ -1251,8 +1382,7 @@
         <w:lang w:val="en-US" w:eastAsia="en-US" w:bidi="ar-SA"/>
       </w:rPr>
     </w:lvl>
-    <w:lvl w:ilvl="2">
-      <w:start w:val="0"/>
+    <w:lvl w:ilvl="2" w:tplc="AA201D9A">
       <w:numFmt w:val="bullet"/>
       <w:lvlText w:val="•"/>
       <w:lvlJc w:val="left"/>
@@ -1264,8 +1394,7 @@
         <w:lang w:val="en-US" w:eastAsia="en-US" w:bidi="ar-SA"/>
       </w:rPr>
     </w:lvl>
-    <w:lvl w:ilvl="3">
-      <w:start w:val="0"/>
+    <w:lvl w:ilvl="3" w:tplc="1AA46DB6">
       <w:numFmt w:val="bullet"/>
       <w:lvlText w:val="•"/>
       <w:lvlJc w:val="left"/>
@@ -1277,8 +1406,7 @@
         <w:lang w:val="en-US" w:eastAsia="en-US" w:bidi="ar-SA"/>
       </w:rPr>
     </w:lvl>
-    <w:lvl w:ilvl="4">
-      <w:start w:val="0"/>
+    <w:lvl w:ilvl="4" w:tplc="42948978">
       <w:numFmt w:val="bullet"/>
       <w:lvlText w:val="•"/>
       <w:lvlJc w:val="left"/>
@@ -1290,8 +1418,7 @@
         <w:lang w:val="en-US" w:eastAsia="en-US" w:bidi="ar-SA"/>
       </w:rPr>
     </w:lvl>
-    <w:lvl w:ilvl="5">
-      <w:start w:val="0"/>
+    <w:lvl w:ilvl="5" w:tplc="606C6836">
       <w:numFmt w:val="bullet"/>
       <w:lvlText w:val="•"/>
       <w:lvlJc w:val="left"/>
@@ -1303,8 +1430,7 @@
         <w:lang w:val="en-US" w:eastAsia="en-US" w:bidi="ar-SA"/>
       </w:rPr>
     </w:lvl>
-    <w:lvl w:ilvl="6">
-      <w:start w:val="0"/>
+    <w:lvl w:ilvl="6" w:tplc="4094CE7C">
       <w:numFmt w:val="bullet"/>
       <w:lvlText w:val="•"/>
       <w:lvlJc w:val="left"/>
@@ -1316,8 +1442,7 @@
         <w:lang w:val="en-US" w:eastAsia="en-US" w:bidi="ar-SA"/>
       </w:rPr>
     </w:lvl>
-    <w:lvl w:ilvl="7">
-      <w:start w:val="0"/>
+    <w:lvl w:ilvl="7" w:tplc="FEA4927E">
       <w:numFmt w:val="bullet"/>
       <w:lvlText w:val="•"/>
       <w:lvlJc w:val="left"/>
@@ -1329,8 +1454,7 @@
         <w:lang w:val="en-US" w:eastAsia="en-US" w:bidi="ar-SA"/>
       </w:rPr>
     </w:lvl>
-    <w:lvl w:ilvl="8">
-      <w:start w:val="0"/>
+    <w:lvl w:ilvl="8" w:tplc="5FF46882">
       <w:numFmt w:val="bullet"/>
       <w:lvlText w:val="•"/>
       <w:lvlJc w:val="left"/>
@@ -1343,18 +1467,18 @@
       </w:rPr>
     </w:lvl>
   </w:abstractNum>
-  <w:num w:numId="1">
+  <w:num w:numId="1" w16cid:durableId="1749115054">
     <w:abstractNumId w:val="0"/>
   </w:num>
 </w:numbering>
 </file>
 
 <file path=word/styles.xml><?xml version="1.0" encoding="utf-8"?>
-<w:styles xmlns:w14="http://schemas.microsoft.com/office/word/2010/wordml" xmlns:wp14="http://schemas.microsoft.com/office/word/2010/wordprocessingDrawing" xmlns:r="http://schemas.openxmlformats.org/officeDocument/2006/relationships" xmlns:w="http://schemas.openxmlformats.org/wordprocessingml/2006/main" xmlns:mc="http://schemas.openxmlformats.org/markup-compatibility/2006" mc:Ignorable="w14 wp14">
+<w:styles xmlns:mc="http://schemas.openxmlformats.org/markup-compatibility/2006" xmlns:r="http://schemas.openxmlformats.org/officeDocument/2006/relationships" xmlns:w="http://schemas.openxmlformats.org/wordprocessingml/2006/main" xmlns:w14="http://schemas.microsoft.com/office/word/2010/wordml" xmlns:w15="http://schemas.microsoft.com/office/word/2012/wordml" xmlns:w16cex="http://schemas.microsoft.com/office/word/2018/wordml/cex" xmlns:w16cid="http://schemas.microsoft.com/office/word/2016/wordml/cid" xmlns:w16="http://schemas.microsoft.com/office/word/2018/wordml" xmlns:w16sdtdh="http://schemas.microsoft.com/office/word/2020/wordml/sdtdatahash" xmlns:w16se="http://schemas.microsoft.com/office/word/2015/wordml/symex" mc:Ignorable="w14 w15 w16se w16cid w16 w16cex w16sdtdh">
   <w:docDefaults>
     <w:rPrDefault>
       <w:rPr>
-        <w:rFonts w:asciiTheme="minorHAnsi" w:hAnsiTheme="minorHAnsi" w:eastAsiaTheme="minorHAnsi" w:cstheme="minorBidi"/>
+        <w:rFonts w:asciiTheme="minorHAnsi" w:eastAsiaTheme="minorHAnsi" w:hAnsiTheme="minorHAnsi" w:cstheme="minorBidi"/>
         <w:sz w:val="22"/>
         <w:szCs w:val="22"/>
         <w:lang w:val="en-US" w:eastAsia="en-US" w:bidi="ar-SA"/>
@@ -1365,49 +1489,476 @@
         <w:widowControl w:val="0"/>
         <w:autoSpaceDE w:val="0"/>
         <w:autoSpaceDN w:val="0"/>
-        <w:spacing w:before="0" w:after="0" w:line="240" w:lineRule="auto"/>
-        <w:ind w:left="0" w:right="0"/>
-        <w:jc w:val="left"/>
       </w:pPr>
     </w:pPrDefault>
   </w:docDefaults>
-  <w:style w:type="character" w:styleId="DefaultParagraphFont" w:default="1">
+  <w:latentStyles w:defLockedState="0" w:defUIPriority="99" w:defSemiHidden="0" w:defUnhideWhenUsed="0" w:defQFormat="0" w:count="376">
+    <w:lsdException w:name="Normal" w:uiPriority="0" w:qFormat="1"/>
+    <w:lsdException w:name="heading 1" w:uiPriority="9" w:qFormat="1"/>
+    <w:lsdException w:name="heading 2" w:semiHidden="1" w:uiPriority="9" w:unhideWhenUsed="1" w:qFormat="1"/>
+    <w:lsdException w:name="heading 3" w:semiHidden="1" w:uiPriority="9" w:unhideWhenUsed="1" w:qFormat="1"/>
+    <w:lsdException w:name="heading 4" w:semiHidden="1" w:uiPriority="9" w:unhideWhenUsed="1" w:qFormat="1"/>
+    <w:lsdException w:name="heading 5" w:semiHidden="1" w:uiPriority="9" w:unhideWhenUsed="1" w:qFormat="1"/>
+    <w:lsdException w:name="heading 6" w:semiHidden="1" w:uiPriority="9" w:unhideWhenUsed="1" w:qFormat="1"/>
+    <w:lsdException w:name="heading 7" w:semiHidden="1" w:uiPriority="9" w:unhideWhenUsed="1" w:qFormat="1"/>
+    <w:lsdException w:name="heading 8" w:semiHidden="1" w:uiPriority="9" w:unhideWhenUsed="1" w:qFormat="1"/>
+    <w:lsdException w:name="heading 9" w:semiHidden="1" w:uiPriority="9" w:unhideWhenUsed="1" w:qFormat="1"/>
+    <w:lsdException w:name="index 1" w:semiHidden="1" w:unhideWhenUsed="1"/>
+    <w:lsdException w:name="index 2" w:semiHidden="1" w:unhideWhenUsed="1"/>
+    <w:lsdException w:name="index 3" w:semiHidden="1" w:unhideWhenUsed="1"/>
+    <w:lsdException w:name="index 4" w:semiHidden="1" w:unhideWhenUsed="1"/>
+    <w:lsdException w:name="index 5" w:semiHidden="1" w:unhideWhenUsed="1"/>
+    <w:lsdException w:name="index 6" w:semiHidden="1" w:unhideWhenUsed="1"/>
+    <w:lsdException w:name="index 7" w:semiHidden="1" w:unhideWhenUsed="1"/>
+    <w:lsdException w:name="index 8" w:semiHidden="1" w:unhideWhenUsed="1"/>
+    <w:lsdException w:name="index 9" w:semiHidden="1" w:unhideWhenUsed="1"/>
+    <w:lsdException w:name="toc 1" w:semiHidden="1" w:uiPriority="39" w:unhideWhenUsed="1"/>
+    <w:lsdException w:name="toc 2" w:semiHidden="1" w:uiPriority="39" w:unhideWhenUsed="1"/>
+    <w:lsdException w:name="toc 3" w:semiHidden="1" w:uiPriority="39" w:unhideWhenUsed="1"/>
+    <w:lsdException w:name="toc 4" w:semiHidden="1" w:uiPriority="39" w:unhideWhenUsed="1"/>
+    <w:lsdException w:name="toc 5" w:semiHidden="1" w:uiPriority="39" w:unhideWhenUsed="1"/>
+    <w:lsdException w:name="toc 6" w:semiHidden="1" w:uiPriority="39" w:unhideWhenUsed="1"/>
+    <w:lsdException w:name="toc 7" w:semiHidden="1" w:uiPriority="39" w:unhideWhenUsed="1"/>
+    <w:lsdException w:name="toc 8" w:semiHidden="1" w:uiPriority="39" w:unhideWhenUsed="1"/>
+    <w:lsdException w:name="toc 9" w:semiHidden="1" w:uiPriority="39" w:unhideWhenUsed="1"/>
+    <w:lsdException w:name="Normal Indent" w:semiHidden="1" w:unhideWhenUsed="1"/>
+    <w:lsdException w:name="footnote text" w:semiHidden="1" w:unhideWhenUsed="1"/>
+    <w:lsdException w:name="annotation text" w:semiHidden="1" w:unhideWhenUsed="1"/>
+    <w:lsdException w:name="header" w:semiHidden="1" w:unhideWhenUsed="1"/>
+    <w:lsdException w:name="footer" w:semiHidden="1" w:unhideWhenUsed="1"/>
+    <w:lsdException w:name="index heading" w:semiHidden="1" w:unhideWhenUsed="1"/>
+    <w:lsdException w:name="caption" w:semiHidden="1" w:uiPriority="35" w:unhideWhenUsed="1" w:qFormat="1"/>
+    <w:lsdException w:name="table of figures" w:semiHidden="1" w:unhideWhenUsed="1"/>
+    <w:lsdException w:name="envelope address" w:semiHidden="1" w:unhideWhenUsed="1"/>
+    <w:lsdException w:name="envelope return" w:semiHidden="1" w:unhideWhenUsed="1"/>
+    <w:lsdException w:name="footnote reference" w:semiHidden="1" w:unhideWhenUsed="1"/>
+    <w:lsdException w:name="annotation reference" w:semiHidden="1" w:unhideWhenUsed="1"/>
+    <w:lsdException w:name="line number" w:semiHidden="1" w:unhideWhenUsed="1"/>
+    <w:lsdException w:name="page number" w:semiHidden="1" w:unhideWhenUsed="1"/>
+    <w:lsdException w:name="endnote reference" w:semiHidden="1" w:unhideWhenUsed="1"/>
+    <w:lsdException w:name="endnote text" w:semiHidden="1" w:unhideWhenUsed="1"/>
+    <w:lsdException w:name="table of authorities" w:semiHidden="1" w:unhideWhenUsed="1"/>
+    <w:lsdException w:name="macro" w:semiHidden="1" w:unhideWhenUsed="1"/>
+    <w:lsdException w:name="toa heading" w:semiHidden="1" w:unhideWhenUsed="1"/>
+    <w:lsdException w:name="List" w:semiHidden="1" w:unhideWhenUsed="1"/>
+    <w:lsdException w:name="List Bullet" w:semiHidden="1" w:unhideWhenUsed="1"/>
+    <w:lsdException w:name="List Number" w:semiHidden="1" w:unhideWhenUsed="1"/>
+    <w:lsdException w:name="List 2" w:semiHidden="1" w:unhideWhenUsed="1"/>
+    <w:lsdException w:name="List 3" w:semiHidden="1" w:unhideWhenUsed="1"/>
+    <w:lsdException w:name="List 4" w:semiHidden="1" w:unhideWhenUsed="1"/>
+    <w:lsdException w:name="List 5" w:semiHidden="1" w:unhideWhenUsed="1"/>
+    <w:lsdException w:name="List Bullet 2" w:semiHidden="1" w:unhideWhenUsed="1"/>
+    <w:lsdException w:name="List Bullet 3" w:semiHidden="1" w:unhideWhenUsed="1"/>
+    <w:lsdException w:name="List Bullet 4" w:semiHidden="1" w:unhideWhenUsed="1"/>
+    <w:lsdException w:name="List Bullet 5" w:semiHidden="1" w:unhideWhenUsed="1"/>
+    <w:lsdException w:name="List Number 2" w:semiHidden="1" w:unhideWhenUsed="1"/>
+    <w:lsdException w:name="List Number 3" w:semiHidden="1" w:unhideWhenUsed="1"/>
+    <w:lsdException w:name="List Number 4" w:semiHidden="1" w:unhideWhenUsed="1"/>
+    <w:lsdException w:name="List Number 5" w:semiHidden="1" w:unhideWhenUsed="1"/>
+    <w:lsdException w:name="Title" w:uiPriority="10" w:qFormat="1"/>
+    <w:lsdException w:name="Closing" w:semiHidden="1" w:unhideWhenUsed="1"/>
+    <w:lsdException w:name="Signature" w:semiHidden="1" w:unhideWhenUsed="1"/>
+    <w:lsdException w:name="Default Paragraph Font" w:semiHidden="1" w:uiPriority="1" w:unhideWhenUsed="1"/>
+    <w:lsdException w:name="Body Text" w:semiHidden="1" w:unhideWhenUsed="1"/>
+    <w:lsdException w:name="Body Text Indent" w:semiHidden="1" w:unhideWhenUsed="1"/>
+    <w:lsdException w:name="List Continue" w:semiHidden="1" w:unhideWhenUsed="1"/>
+    <w:lsdException w:name="List Continue 2" w:semiHidden="1" w:unhideWhenUsed="1"/>
+    <w:lsdException w:name="List Continue 3" w:semiHidden="1" w:unhideWhenUsed="1"/>
+    <w:lsdException w:name="List Continue 4" w:semiHidden="1" w:unhideWhenUsed="1"/>
+    <w:lsdException w:name="List Continue 5" w:semiHidden="1" w:unhideWhenUsed="1"/>
+    <w:lsdException w:name="Message Header" w:semiHidden="1" w:unhideWhenUsed="1"/>
+    <w:lsdException w:name="Subtitle" w:uiPriority="11" w:qFormat="1"/>
+    <w:lsdException w:name="Salutation" w:semiHidden="1" w:unhideWhenUsed="1"/>
+    <w:lsdException w:name="Date" w:semiHidden="1" w:unhideWhenUsed="1"/>
+    <w:lsdException w:name="Body Text First Indent" w:semiHidden="1" w:unhideWhenUsed="1"/>
+    <w:lsdException w:name="Body Text First Indent 2" w:semiHidden="1" w:unhideWhenUsed="1"/>
+    <w:lsdException w:name="Note Heading" w:semiHidden="1" w:unhideWhenUsed="1"/>
+    <w:lsdException w:name="Body Text 2" w:semiHidden="1" w:unhideWhenUsed="1"/>
+    <w:lsdException w:name="Body Text 3" w:semiHidden="1" w:unhideWhenUsed="1"/>
+    <w:lsdException w:name="Body Text Indent 2" w:semiHidden="1" w:unhideWhenUsed="1"/>
+    <w:lsdException w:name="Body Text Indent 3" w:semiHidden="1" w:unhideWhenUsed="1"/>
+    <w:lsdException w:name="Block Text" w:semiHidden="1" w:unhideWhenUsed="1"/>
+    <w:lsdException w:name="Hyperlink" w:semiHidden="1" w:unhideWhenUsed="1"/>
+    <w:lsdException w:name="FollowedHyperlink" w:semiHidden="1" w:unhideWhenUsed="1"/>
+    <w:lsdException w:name="Strong" w:uiPriority="22" w:qFormat="1"/>
+    <w:lsdException w:name="Emphasis" w:uiPriority="20" w:qFormat="1"/>
+    <w:lsdException w:name="Document Map" w:semiHidden="1" w:unhideWhenUsed="1"/>
+    <w:lsdException w:name="Plain Text" w:semiHidden="1" w:unhideWhenUsed="1"/>
+    <w:lsdException w:name="E-mail Signature" w:semiHidden="1" w:unhideWhenUsed="1"/>
+    <w:lsdException w:name="HTML Top of Form" w:semiHidden="1" w:unhideWhenUsed="1"/>
+    <w:lsdException w:name="HTML Bottom of Form" w:semiHidden="1" w:unhideWhenUsed="1"/>
+    <w:lsdException w:name="Normal (Web)" w:semiHidden="1" w:unhideWhenUsed="1"/>
+    <w:lsdException w:name="HTML Acronym" w:semiHidden="1" w:unhideWhenUsed="1"/>
+    <w:lsdException w:name="HTML Address" w:semiHidden="1" w:unhideWhenUsed="1"/>
+    <w:lsdException w:name="HTML Cite" w:semiHidden="1" w:unhideWhenUsed="1"/>
+    <w:lsdException w:name="HTML Code" w:semiHidden="1" w:unhideWhenUsed="1"/>
+    <w:lsdException w:name="HTML Definition" w:semiHidden="1" w:unhideWhenUsed="1"/>
+    <w:lsdException w:name="HTML Keyboard" w:semiHidden="1" w:unhideWhenUsed="1"/>
+    <w:lsdException w:name="HTML Preformatted" w:semiHidden="1" w:unhideWhenUsed="1"/>
+    <w:lsdException w:name="HTML Sample" w:semiHidden="1" w:unhideWhenUsed="1"/>
+    <w:lsdException w:name="HTML Typewriter" w:semiHidden="1" w:unhideWhenUsed="1"/>
+    <w:lsdException w:name="HTML Variable" w:semiHidden="1" w:unhideWhenUsed="1"/>
+    <w:lsdException w:name="Normal Table" w:semiHidden="1" w:unhideWhenUsed="1"/>
+    <w:lsdException w:name="annotation subject" w:semiHidden="1" w:unhideWhenUsed="1"/>
+    <w:lsdException w:name="No List" w:semiHidden="1" w:unhideWhenUsed="1"/>
+    <w:lsdException w:name="Outline List 1" w:semiHidden="1" w:unhideWhenUsed="1"/>
+    <w:lsdException w:name="Outline List 2" w:semiHidden="1" w:unhideWhenUsed="1"/>
+    <w:lsdException w:name="Outline List 3" w:semiHidden="1" w:unhideWhenUsed="1"/>
+    <w:lsdException w:name="Table Simple 1" w:semiHidden="1" w:unhideWhenUsed="1"/>
+    <w:lsdException w:name="Table Simple 2" w:semiHidden="1" w:unhideWhenUsed="1"/>
+    <w:lsdException w:name="Table Simple 3" w:semiHidden="1" w:unhideWhenUsed="1"/>
+    <w:lsdException w:name="Table Classic 1" w:semiHidden="1" w:unhideWhenUsed="1"/>
+    <w:lsdException w:name="Table Classic 2" w:semiHidden="1" w:unhideWhenUsed="1"/>
+    <w:lsdException w:name="Table Classic 3" w:semiHidden="1" w:unhideWhenUsed="1"/>
+    <w:lsdException w:name="Table Classic 4" w:semiHidden="1" w:unhideWhenUsed="1"/>
+    <w:lsdException w:name="Table Colorful 1" w:semiHidden="1" w:unhideWhenUsed="1"/>
+    <w:lsdException w:name="Table Colorful 2" w:semiHidden="1" w:unhideWhenUsed="1"/>
+    <w:lsdException w:name="Table Colorful 3" w:semiHidden="1" w:unhideWhenUsed="1"/>
+    <w:lsdException w:name="Table Columns 1" w:semiHidden="1" w:unhideWhenUsed="1"/>
+    <w:lsdException w:name="Table Columns 2" w:semiHidden="1" w:unhideWhenUsed="1"/>
+    <w:lsdException w:name="Table Columns 3" w:semiHidden="1" w:unhideWhenUsed="1"/>
+    <w:lsdException w:name="Table Columns 4" w:semiHidden="1" w:unhideWhenUsed="1"/>
+    <w:lsdException w:name="Table Columns 5" w:semiHidden="1" w:unhideWhenUsed="1"/>
+    <w:lsdException w:name="Table Grid 1" w:semiHidden="1" w:unhideWhenUsed="1"/>
+    <w:lsdException w:name="Table Grid 2" w:semiHidden="1" w:unhideWhenUsed="1"/>
+    <w:lsdException w:name="Table Grid 3" w:semiHidden="1" w:unhideWhenUsed="1"/>
+    <w:lsdException w:name="Table Grid 4" w:semiHidden="1" w:unhideWhenUsed="1"/>
+    <w:lsdException w:name="Table Grid 5" w:semiHidden="1" w:unhideWhenUsed="1"/>
+    <w:lsdException w:name="Table Grid 6" w:semiHidden="1" w:unhideWhenUsed="1"/>
+    <w:lsdException w:name="Table Grid 7" w:semiHidden="1" w:unhideWhenUsed="1"/>
+    <w:lsdException w:name="Table Grid 8" w:semiHidden="1" w:unhideWhenUsed="1"/>
+    <w:lsdException w:name="Table List 1" w:semiHidden="1" w:unhideWhenUsed="1"/>
+    <w:lsdException w:name="Table List 2" w:semiHidden="1" w:unhideWhenUsed="1"/>
+    <w:lsdException w:name="Table List 3" w:semiHidden="1" w:unhideWhenUsed="1"/>
+    <w:lsdException w:name="Table List 4" w:semiHidden="1" w:unhideWhenUsed="1"/>
+    <w:lsdException w:name="Table List 5" w:semiHidden="1" w:unhideWhenUsed="1"/>
+    <w:lsdException w:name="Table List 6" w:semiHidden="1" w:unhideWhenUsed="1"/>
+    <w:lsdException w:name="Table List 7" w:semiHidden="1" w:unhideWhenUsed="1"/>
+    <w:lsdException w:name="Table List 8" w:semiHidden="1" w:unhideWhenUsed="1"/>
+    <w:lsdException w:name="Table 3D effects 1" w:semiHidden="1" w:unhideWhenUsed="1"/>
+    <w:lsdException w:name="Table 3D effects 2" w:semiHidden="1" w:unhideWhenUsed="1"/>
+    <w:lsdException w:name="Table 3D effects 3" w:semiHidden="1" w:unhideWhenUsed="1"/>
+    <w:lsdException w:name="Table Contemporary" w:semiHidden="1" w:unhideWhenUsed="1"/>
+    <w:lsdException w:name="Table Elegant" w:semiHidden="1" w:unhideWhenUsed="1"/>
+    <w:lsdException w:name="Table Professional" w:semiHidden="1" w:unhideWhenUsed="1"/>
+    <w:lsdException w:name="Table Subtle 1" w:semiHidden="1" w:unhideWhenUsed="1"/>
+    <w:lsdException w:name="Table Subtle 2" w:semiHidden="1" w:unhideWhenUsed="1"/>
+    <w:lsdException w:name="Table Web 1" w:semiHidden="1" w:unhideWhenUsed="1"/>
+    <w:lsdException w:name="Table Web 2" w:semiHidden="1" w:unhideWhenUsed="1"/>
+    <w:lsdException w:name="Table Web 3" w:semiHidden="1" w:unhideWhenUsed="1"/>
+    <w:lsdException w:name="Balloon Text" w:semiHidden="1" w:unhideWhenUsed="1"/>
+    <w:lsdException w:name="Table Grid" w:uiPriority="39"/>
+    <w:lsdException w:name="Table Theme" w:semiHidden="1" w:unhideWhenUsed="1"/>
+    <w:lsdException w:name="Placeholder Text" w:semiHidden="1"/>
+    <w:lsdException w:name="No Spacing" w:uiPriority="1" w:qFormat="1"/>
+    <w:lsdException w:name="Light Shading" w:uiPriority="60"/>
+    <w:lsdException w:name="Light List" w:uiPriority="61"/>
+    <w:lsdException w:name="Light Grid" w:uiPriority="62"/>
+    <w:lsdException w:name="Medium Shading 1" w:uiPriority="63"/>
+    <w:lsdException w:name="Medium Shading 2" w:uiPriority="64"/>
+    <w:lsdException w:name="Medium List 1" w:uiPriority="65"/>
+    <w:lsdException w:name="Medium List 2" w:uiPriority="66"/>
+    <w:lsdException w:name="Medium Grid 1" w:uiPriority="67"/>
+    <w:lsdException w:name="Medium Grid 2" w:uiPriority="68"/>
+    <w:lsdException w:name="Medium Grid 3" w:uiPriority="69"/>
+    <w:lsdException w:name="Dark List" w:uiPriority="70"/>
+    <w:lsdException w:name="Colorful Shading" w:uiPriority="71"/>
+    <w:lsdException w:name="Colorful List" w:uiPriority="72"/>
+    <w:lsdException w:name="Colorful Grid" w:uiPriority="73"/>
+    <w:lsdException w:name="Light Shading Accent 1" w:uiPriority="60"/>
+    <w:lsdException w:name="Light List Accent 1" w:uiPriority="61"/>
+    <w:lsdException w:name="Light Grid Accent 1" w:uiPriority="62"/>
+    <w:lsdException w:name="Medium Shading 1 Accent 1" w:uiPriority="63"/>
+    <w:lsdException w:name="Medium Shading 2 Accent 1" w:uiPriority="64"/>
+    <w:lsdException w:name="Medium List 1 Accent 1" w:uiPriority="65"/>
+    <w:lsdException w:name="Revision" w:semiHidden="1"/>
+    <w:lsdException w:name="List Paragraph" w:uiPriority="34" w:qFormat="1"/>
+    <w:lsdException w:name="Quote" w:uiPriority="29" w:qFormat="1"/>
+    <w:lsdException w:name="Intense Quote" w:uiPriority="30" w:qFormat="1"/>
+    <w:lsdException w:name="Medium List 2 Accent 1" w:uiPriority="66"/>
+    <w:lsdException w:name="Medium Grid 1 Accent 1" w:uiPriority="67"/>
+    <w:lsdException w:name="Medium Grid 2 Accent 1" w:uiPriority="68"/>
+    <w:lsdException w:name="Medium Grid 3 Accent 1" w:uiPriority="69"/>
+    <w:lsdException w:name="Dark List Accent 1" w:uiPriority="70"/>
+    <w:lsdException w:name="Colorful Shading Accent 1" w:uiPriority="71"/>
+    <w:lsdException w:name="Colorful List Accent 1" w:uiPriority="72"/>
+    <w:lsdException w:name="Colorful Grid Accent 1" w:uiPriority="73"/>
+    <w:lsdException w:name="Light Shading Accent 2" w:uiPriority="60"/>
+    <w:lsdException w:name="Light List Accent 2" w:uiPriority="61"/>
+    <w:lsdException w:name="Light Grid Accent 2" w:uiPriority="62"/>
+    <w:lsdException w:name="Medium Shading 1 Accent 2" w:uiPriority="63"/>
+    <w:lsdException w:name="Medium Shading 2 Accent 2" w:uiPriority="64"/>
+    <w:lsdException w:name="Medium List 1 Accent 2" w:uiPriority="65"/>
+    <w:lsdException w:name="Medium List 2 Accent 2" w:uiPriority="66"/>
+    <w:lsdException w:name="Medium Grid 1 Accent 2" w:uiPriority="67"/>
+    <w:lsdException w:name="Medium Grid 2 Accent 2" w:uiPriority="68"/>
+    <w:lsdException w:name="Medium Grid 3 Accent 2" w:uiPriority="69"/>
+    <w:lsdException w:name="Dark List Accent 2" w:uiPriority="70"/>
+    <w:lsdException w:name="Colorful Shading Accent 2" w:uiPriority="71"/>
+    <w:lsdException w:name="Colorful List Accent 2" w:uiPriority="72"/>
+    <w:lsdException w:name="Colorful Grid Accent 2" w:uiPriority="73"/>
+    <w:lsdException w:name="Light Shading Accent 3" w:uiPriority="60"/>
+    <w:lsdException w:name="Light List Accent 3" w:uiPriority="61"/>
+    <w:lsdException w:name="Light Grid Accent 3" w:uiPriority="62"/>
+    <w:lsdException w:name="Medium Shading 1 Accent 3" w:uiPriority="63"/>
+    <w:lsdException w:name="Medium Shading 2 Accent 3" w:uiPriority="64"/>
+    <w:lsdException w:name="Medium List 1 Accent 3" w:uiPriority="65"/>
+    <w:lsdException w:name="Medium List 2 Accent 3" w:uiPriority="66"/>
+    <w:lsdException w:name="Medium Grid 1 Accent 3" w:uiPriority="67"/>
+    <w:lsdException w:name="Medium Grid 2 Accent 3" w:uiPriority="68"/>
+    <w:lsdException w:name="Medium Grid 3 Accent 3" w:uiPriority="69"/>
+    <w:lsdException w:name="Dark List Accent 3" w:uiPriority="70"/>
+    <w:lsdException w:name="Colorful Shading Accent 3" w:uiPriority="71"/>
+    <w:lsdException w:name="Colorful List Accent 3" w:uiPriority="72"/>
+    <w:lsdException w:name="Colorful Grid Accent 3" w:uiPriority="73"/>
+    <w:lsdException w:name="Light Shading Accent 4" w:uiPriority="60"/>
+    <w:lsdException w:name="Light List Accent 4" w:uiPriority="61"/>
+    <w:lsdException w:name="Light Grid Accent 4" w:uiPriority="62"/>
+    <w:lsdException w:name="Medium Shading 1 Accent 4" w:uiPriority="63"/>
+    <w:lsdException w:name="Medium Shading 2 Accent 4" w:uiPriority="64"/>
+    <w:lsdException w:name="Medium List 1 Accent 4" w:uiPriority="65"/>
+    <w:lsdException w:name="Medium List 2 Accent 4" w:uiPriority="66"/>
+    <w:lsdException w:name="Medium Grid 1 Accent 4" w:uiPriority="67"/>
+    <w:lsdException w:name="Medium Grid 2 Accent 4" w:uiPriority="68"/>
+    <w:lsdException w:name="Medium Grid 3 Accent 4" w:uiPriority="69"/>
+    <w:lsdException w:name="Dark List Accent 4" w:uiPriority="70"/>
+    <w:lsdException w:name="Colorful Shading Accent 4" w:uiPriority="71"/>
+    <w:lsdException w:name="Colorful List Accent 4" w:uiPriority="72"/>
+    <w:lsdException w:name="Colorful Grid Accent 4" w:uiPriority="73"/>
+    <w:lsdException w:name="Light Shading Accent 5" w:uiPriority="60"/>
+    <w:lsdException w:name="Light List Accent 5" w:uiPriority="61"/>
+    <w:lsdException w:name="Light Grid Accent 5" w:uiPriority="62"/>
+    <w:lsdException w:name="Medium Shading 1 Accent 5" w:uiPriority="63"/>
+    <w:lsdException w:name="Medium Shading 2 Accent 5" w:uiPriority="64"/>
+    <w:lsdException w:name="Medium List 1 Accent 5" w:uiPriority="65"/>
+    <w:lsdException w:name="Medium List 2 Accent 5" w:uiPriority="66"/>
+    <w:lsdException w:name="Medium Grid 1 Accent 5" w:uiPriority="67"/>
+    <w:lsdException w:name="Medium Grid 2 Accent 5" w:uiPriority="68"/>
+    <w:lsdException w:name="Medium Grid 3 Accent 5" w:uiPriority="69"/>
+    <w:lsdException w:name="Dark List Accent 5" w:uiPriority="70"/>
+    <w:lsdException w:name="Colorful Shading Accent 5" w:uiPriority="71"/>
+    <w:lsdException w:name="Colorful List Accent 5" w:uiPriority="72"/>
+    <w:lsdException w:name="Colorful Grid Accent 5" w:uiPriority="73"/>
+    <w:lsdException w:name="Light Shading Accent 6" w:uiPriority="60"/>
+    <w:lsdException w:name="Light List Accent 6" w:uiPriority="61"/>
+    <w:lsdException w:name="Light Grid Accent 6" w:uiPriority="62"/>
+    <w:lsdException w:name="Medium Shading 1 Accent 6" w:uiPriority="63"/>
+    <w:lsdException w:name="Medium Shading 2 Accent 6" w:uiPriority="64"/>
+    <w:lsdException w:name="Medium List 1 Accent 6" w:uiPriority="65"/>
+    <w:lsdException w:name="Medium List 2 Accent 6" w:uiPriority="66"/>
+    <w:lsdException w:name="Medium Grid 1 Accent 6" w:uiPriority="67"/>
+    <w:lsdException w:name="Medium Grid 2 Accent 6" w:uiPriority="68"/>
+    <w:lsdException w:name="Medium Grid 3 Accent 6" w:uiPriority="69"/>
+    <w:lsdException w:name="Dark List Accent 6" w:uiPriority="70"/>
+    <w:lsdException w:name="Colorful Shading Accent 6" w:uiPriority="71"/>
+    <w:lsdException w:name="Colorful List Accent 6" w:uiPriority="72"/>
+    <w:lsdException w:name="Colorful Grid Accent 6" w:uiPriority="73"/>
+    <w:lsdException w:name="Subtle Emphasis" w:uiPriority="19" w:qFormat="1"/>
+    <w:lsdException w:name="Intense Emphasis" w:uiPriority="21" w:qFormat="1"/>
+    <w:lsdException w:name="Subtle Reference" w:uiPriority="31" w:qFormat="1"/>
+    <w:lsdException w:name="Intense Reference" w:uiPriority="32" w:qFormat="1"/>
+    <w:lsdException w:name="Book Title" w:uiPriority="33" w:qFormat="1"/>
+    <w:lsdException w:name="Bibliography" w:semiHidden="1" w:uiPriority="37" w:unhideWhenUsed="1"/>
+    <w:lsdException w:name="TOC Heading" w:semiHidden="1" w:uiPriority="39" w:unhideWhenUsed="1" w:qFormat="1"/>
+    <w:lsdException w:name="Plain Table 1" w:uiPriority="41"/>
+    <w:lsdException w:name="Plain Table 2" w:uiPriority="42"/>
+    <w:lsdException w:name="Plain Table 3" w:uiPriority="43"/>
+    <w:lsdException w:name="Plain Table 4" w:uiPriority="44"/>
+    <w:lsdException w:name="Plain Table 5" w:uiPriority="45"/>
+    <w:lsdException w:name="Grid Table Light" w:uiPriority="40"/>
+    <w:lsdException w:name="Grid Table 1 Light" w:uiPriority="46"/>
+    <w:lsdException w:name="Grid Table 2" w:uiPriority="47"/>
+    <w:lsdException w:name="Grid Table 3" w:uiPriority="48"/>
+    <w:lsdException w:name="Grid Table 4" w:uiPriority="49"/>
+    <w:lsdException w:name="Grid Table 5 Dark" w:uiPriority="50"/>
+    <w:lsdException w:name="Grid Table 6 Colorful" w:uiPriority="51"/>
+    <w:lsdException w:name="Grid Table 7 Colorful" w:uiPriority="52"/>
+    <w:lsdException w:name="Grid Table 1 Light Accent 1" w:uiPriority="46"/>
+    <w:lsdException w:name="Grid Table 2 Accent 1" w:uiPriority="47"/>
+    <w:lsdException w:name="Grid Table 3 Accent 1" w:uiPriority="48"/>
+    <w:lsdException w:name="Grid Table 4 Accent 1" w:uiPriority="49"/>
+    <w:lsdException w:name="Grid Table 5 Dark Accent 1" w:uiPriority="50"/>
+    <w:lsdException w:name="Grid Table 6 Colorful Accent 1" w:uiPriority="51"/>
+    <w:lsdException w:name="Grid Table 7 Colorful Accent 1" w:uiPriority="52"/>
+    <w:lsdException w:name="Grid Table 1 Light Accent 2" w:uiPriority="46"/>
+    <w:lsdException w:name="Grid Table 2 Accent 2" w:uiPriority="47"/>
+    <w:lsdException w:name="Grid Table 3 Accent 2" w:uiPriority="48"/>
+    <w:lsdException w:name="Grid Table 4 Accent 2" w:uiPriority="49"/>
+    <w:lsdException w:name="Grid Table 5 Dark Accent 2" w:uiPriority="50"/>
+    <w:lsdException w:name="Grid Table 6 Colorful Accent 2" w:uiPriority="51"/>
+    <w:lsdException w:name="Grid Table 7 Colorful Accent 2" w:uiPriority="52"/>
+    <w:lsdException w:name="Grid Table 1 Light Accent 3" w:uiPriority="46"/>
+    <w:lsdException w:name="Grid Table 2 Accent 3" w:uiPriority="47"/>
+    <w:lsdException w:name="Grid Table 3 Accent 3" w:uiPriority="48"/>
+    <w:lsdException w:name="Grid Table 4 Accent 3" w:uiPriority="49"/>
+    <w:lsdException w:name="Grid Table 5 Dark Accent 3" w:uiPriority="50"/>
+    <w:lsdException w:name="Grid Table 6 Colorful Accent 3" w:uiPriority="51"/>
+    <w:lsdException w:name="Grid Table 7 Colorful Accent 3" w:uiPriority="52"/>
+    <w:lsdException w:name="Grid Table 1 Light Accent 4" w:uiPriority="46"/>
+    <w:lsdException w:name="Grid Table 2 Accent 4" w:uiPriority="47"/>
+    <w:lsdException w:name="Grid Table 3 Accent 4" w:uiPriority="48"/>
+    <w:lsdException w:name="Grid Table 4 Accent 4" w:uiPriority="49"/>
+    <w:lsdException w:name="Grid Table 5 Dark Accent 4" w:uiPriority="50"/>
+    <w:lsdException w:name="Grid Table 6 Colorful Accent 4" w:uiPriority="51"/>
+    <w:lsdException w:name="Grid Table 7 Colorful Accent 4" w:uiPriority="52"/>
+    <w:lsdException w:name="Grid Table 1 Light Accent 5" w:uiPriority="46"/>
+    <w:lsdException w:name="Grid Table 2 Accent 5" w:uiPriority="47"/>
+    <w:lsdException w:name="Grid Table 3 Accent 5" w:uiPriority="48"/>
+    <w:lsdException w:name="Grid Table 4 Accent 5" w:uiPriority="49"/>
+    <w:lsdException w:name="Grid Table 5 Dark Accent 5" w:uiPriority="50"/>
+    <w:lsdException w:name="Grid Table 6 Colorful Accent 5" w:uiPriority="51"/>
+    <w:lsdException w:name="Grid Table 7 Colorful Accent 5" w:uiPriority="52"/>
+    <w:lsdException w:name="Grid Table 1 Light Accent 6" w:uiPriority="46"/>
+    <w:lsdException w:name="Grid Table 2 Accent 6" w:uiPriority="47"/>
+    <w:lsdException w:name="Grid Table 3 Accent 6" w:uiPriority="48"/>
+    <w:lsdException w:name="Grid Table 4 Accent 6" w:uiPriority="49"/>
+    <w:lsdException w:name="Grid Table 5 Dark Accent 6" w:uiPriority="50"/>
+    <w:lsdException w:name="Grid Table 6 Colorful Accent 6" w:uiPriority="51"/>
+    <w:lsdException w:name="Grid Table 7 Colorful Accent 6" w:uiPriority="52"/>
+    <w:lsdException w:name="List Table 1 Light" w:uiPriority="46"/>
+    <w:lsdException w:name="List Table 2" w:uiPriority="47"/>
+    <w:lsdException w:name="List Table 3" w:uiPriority="48"/>
+    <w:lsdException w:name="List Table 4" w:uiPriority="49"/>
+    <w:lsdException w:name="List Table 5 Dark" w:uiPriority="50"/>
+    <w:lsdException w:name="List Table 6 Colorful" w:uiPriority="51"/>
+    <w:lsdException w:name="List Table 7 Colorful" w:uiPriority="52"/>
+    <w:lsdException w:name="List Table 1 Light Accent 1" w:uiPriority="46"/>
+    <w:lsdException w:name="List Table 2 Accent 1" w:uiPriority="47"/>
+    <w:lsdException w:name="List Table 3 Accent 1" w:uiPriority="48"/>
+    <w:lsdException w:name="List Table 4 Accent 1" w:uiPriority="49"/>
+    <w:lsdException w:name="List Table 5 Dark Accent 1" w:uiPriority="50"/>
+    <w:lsdException w:name="List Table 6 Colorful Accent 1" w:uiPriority="51"/>
+    <w:lsdException w:name="List Table 7 Colorful Accent 1" w:uiPriority="52"/>
+    <w:lsdException w:name="List Table 1 Light Accent 2" w:uiPriority="46"/>
+    <w:lsdException w:name="List Table 2 Accent 2" w:uiPriority="47"/>
+    <w:lsdException w:name="List Table 3 Accent 2" w:uiPriority="48"/>
+    <w:lsdException w:name="List Table 4 Accent 2" w:uiPriority="49"/>
+    <w:lsdException w:name="List Table 5 Dark Accent 2" w:uiPriority="50"/>
+    <w:lsdException w:name="List Table 6 Colorful Accent 2" w:uiPriority="51"/>
+    <w:lsdException w:name="List Table 7 Colorful Accent 2" w:uiPriority="52"/>
+    <w:lsdException w:name="List Table 1 Light Accent 3" w:uiPriority="46"/>
+    <w:lsdException w:name="List Table 2 Accent 3" w:uiPriority="47"/>
+    <w:lsdException w:name="List Table 3 Accent 3" w:uiPriority="48"/>
+    <w:lsdException w:name="List Table 4 Accent 3" w:uiPriority="49"/>
+    <w:lsdException w:name="List Table 5 Dark Accent 3" w:uiPriority="50"/>
+    <w:lsdException w:name="List Table 6 Colorful Accent 3" w:uiPriority="51"/>
+    <w:lsdException w:name="List Table 7 Colorful Accent 3" w:uiPriority="52"/>
+    <w:lsdException w:name="List Table 1 Light Accent 4" w:uiPriority="46"/>
+    <w:lsdException w:name="List Table 2 Accent 4" w:uiPriority="47"/>
+    <w:lsdException w:name="List Table 3 Accent 4" w:uiPriority="48"/>
+    <w:lsdException w:name="List Table 4 Accent 4" w:uiPriority="49"/>
+    <w:lsdException w:name="List Table 5 Dark Accent 4" w:uiPriority="50"/>
+    <w:lsdException w:name="List Table 6 Colorful Accent 4" w:uiPriority="51"/>
+    <w:lsdException w:name="List Table 7 Colorful Accent 4" w:uiPriority="52"/>
+    <w:lsdException w:name="List Table 1 Light Accent 5" w:uiPriority="46"/>
+    <w:lsdException w:name="List Table 2 Accent 5" w:uiPriority="47"/>
+    <w:lsdException w:name="List Table 3 Accent 5" w:uiPriority="48"/>
+    <w:lsdException w:name="List Table 4 Accent 5" w:uiPriority="49"/>
+    <w:lsdException w:name="List Table 5 Dark Accent 5" w:uiPriority="50"/>
+    <w:lsdException w:name="List Table 6 Colorful Accent 5" w:uiPriority="51"/>
+    <w:lsdException w:name="List Table 7 Colorful Accent 5" w:uiPriority="52"/>
+    <w:lsdException w:name="List Table 1 Light Accent 6" w:uiPriority="46"/>
+    <w:lsdException w:name="List Table 2 Accent 6" w:uiPriority="47"/>
+    <w:lsdException w:name="List Table 3 Accent 6" w:uiPriority="48"/>
+    <w:lsdException w:name="List Table 4 Accent 6" w:uiPriority="49"/>
+    <w:lsdException w:name="List Table 5 Dark Accent 6" w:uiPriority="50"/>
+    <w:lsdException w:name="List Table 6 Colorful Accent 6" w:uiPriority="51"/>
+    <w:lsdException w:name="List Table 7 Colorful Accent 6" w:uiPriority="52"/>
+    <w:lsdException w:name="Mention" w:semiHidden="1" w:unhideWhenUsed="1"/>
+    <w:lsdException w:name="Smart Hyperlink" w:semiHidden="1" w:unhideWhenUsed="1"/>
+    <w:lsdException w:name="Hashtag" w:semiHidden="1" w:unhideWhenUsed="1"/>
+    <w:lsdException w:name="Unresolved Mention" w:semiHidden="1" w:unhideWhenUsed="1"/>
+    <w:lsdException w:name="Smart Link" w:semiHidden="1" w:unhideWhenUsed="1"/>
+  </w:latentStyles>
+  <w:style w:type="paragraph" w:default="1" w:styleId="Normal">
+    <w:name w:val="Normal"/>
+    <w:qFormat/>
+    <w:rPr>
+      <w:rFonts w:ascii="Arial MT" w:eastAsia="Arial MT" w:hAnsi="Arial MT" w:cs="Arial MT"/>
+    </w:rPr>
+  </w:style>
+  <w:style w:type="paragraph" w:styleId="Heading1">
+    <w:name w:val="heading 1"/>
+    <w:basedOn w:val="Normal"/>
+    <w:uiPriority w:val="9"/>
+    <w:qFormat/>
+    <w:pPr>
+      <w:ind w:left="85"/>
+      <w:outlineLvl w:val="0"/>
+    </w:pPr>
+    <w:rPr>
+      <w:rFonts w:ascii="Arial" w:eastAsia="Arial" w:hAnsi="Arial" w:cs="Arial"/>
+      <w:b/>
+      <w:bCs/>
+      <w:sz w:val="36"/>
+      <w:szCs w:val="36"/>
+    </w:rPr>
+  </w:style>
+  <w:style w:type="paragraph" w:styleId="Heading2">
+    <w:name w:val="heading 2"/>
+    <w:basedOn w:val="Normal"/>
+    <w:uiPriority w:val="9"/>
+    <w:unhideWhenUsed/>
+    <w:qFormat/>
+    <w:pPr>
+      <w:spacing w:before="125"/>
+      <w:ind w:left="85"/>
+      <w:outlineLvl w:val="1"/>
+    </w:pPr>
+    <w:rPr>
+      <w:rFonts w:ascii="Arial" w:eastAsia="Arial" w:hAnsi="Arial" w:cs="Arial"/>
+      <w:b/>
+      <w:bCs/>
+      <w:sz w:val="21"/>
+      <w:szCs w:val="21"/>
+    </w:rPr>
+  </w:style>
+  <w:style w:type="paragraph" w:styleId="Heading3">
+    <w:name w:val="heading 3"/>
+    <w:basedOn w:val="Normal"/>
+    <w:uiPriority w:val="9"/>
+    <w:semiHidden/>
+    <w:unhideWhenUsed/>
+    <w:qFormat/>
+    <w:pPr>
+      <w:spacing w:before="136"/>
+      <w:ind w:left="85"/>
+      <w:outlineLvl w:val="2"/>
+    </w:pPr>
+    <w:rPr>
+      <w:rFonts w:ascii="Arial" w:eastAsia="Arial" w:hAnsi="Arial" w:cs="Arial"/>
+      <w:b/>
+      <w:bCs/>
+      <w:sz w:val="16"/>
+      <w:szCs w:val="16"/>
+    </w:rPr>
+  </w:style>
+  <w:style w:type="character" w:default="1" w:styleId="DefaultParagraphFont">
     <w:name w:val="Default Paragraph Font"/>
     <w:uiPriority w:val="1"/>
     <w:semiHidden/>
     <w:unhideWhenUsed/>
   </w:style>
-  <w:style w:type="table" w:styleId="TableNormal" w:default="1">
+  <w:style w:type="table" w:default="1" w:styleId="TableNormal">
     <w:name w:val="Normal Table"/>
-    <w:uiPriority w:val="2"/>
+    <w:uiPriority w:val="99"/>
     <w:semiHidden/>
     <w:unhideWhenUsed/>
-    <w:qFormat/>
     <w:tblPr>
       <w:tblInd w:w="0" w:type="dxa"/>
       <w:tblCellMar>
         <w:top w:w="0" w:type="dxa"/>
-        <w:left w:w="0" w:type="dxa"/>
+        <w:left w:w="108" w:type="dxa"/>
         <w:bottom w:w="0" w:type="dxa"/>
-        <w:right w:w="0" w:type="dxa"/>
+        <w:right w:w="108" w:type="dxa"/>
       </w:tblCellMar>
     </w:tblPr>
   </w:style>
-  <w:style w:type="numbering" w:styleId="NoList" w:default="1">
+  <w:style w:type="numbering" w:default="1" w:styleId="NoList">
     <w:name w:val="No List"/>
     <w:uiPriority w:val="99"/>
     <w:semiHidden/>
     <w:unhideWhenUsed/>
-  </w:style>
-  <w:style w:type="paragraph" w:styleId="Normal" w:default="1">
-    <w:name w:val="Normal"/>
-    <w:uiPriority w:val="1"/>
-    <w:qFormat/>
-    <w:pPr/>
-    <w:rPr>
-      <w:rFonts w:ascii="Arial MT" w:hAnsi="Arial MT" w:eastAsia="Arial MT" w:cs="Arial MT"/>
-      <w:lang w:val="en-US" w:eastAsia="en-US" w:bidi="ar-SA"/>
-    </w:rPr>
   </w:style>
   <w:style w:type="paragraph" w:styleId="BodyText">
     <w:name w:val="Body Text"/>
@@ -1419,66 +1970,8 @@
       <w:ind w:left="354" w:hanging="193"/>
     </w:pPr>
     <w:rPr>
-      <w:rFonts w:ascii="Arial MT" w:hAnsi="Arial MT" w:eastAsia="Arial MT" w:cs="Arial MT"/>
       <w:sz w:val="16"/>
       <w:szCs w:val="16"/>
-      <w:lang w:val="en-US" w:eastAsia="en-US" w:bidi="ar-SA"/>
-    </w:rPr>
-  </w:style>
-  <w:style w:type="paragraph" w:styleId="Heading1">
-    <w:name w:val="heading 1"/>
-    <w:basedOn w:val="Normal"/>
-    <w:uiPriority w:val="1"/>
-    <w:qFormat/>
-    <w:pPr>
-      <w:ind w:left="85"/>
-      <w:outlineLvl w:val="1"/>
-    </w:pPr>
-    <w:rPr>
-      <w:rFonts w:ascii="Arial" w:hAnsi="Arial" w:eastAsia="Arial" w:cs="Arial"/>
-      <w:b/>
-      <w:bCs/>
-      <w:sz w:val="36"/>
-      <w:szCs w:val="36"/>
-      <w:lang w:val="en-US" w:eastAsia="en-US" w:bidi="ar-SA"/>
-    </w:rPr>
-  </w:style>
-  <w:style w:type="paragraph" w:styleId="Heading2">
-    <w:name w:val="heading 2"/>
-    <w:basedOn w:val="Normal"/>
-    <w:uiPriority w:val="1"/>
-    <w:qFormat/>
-    <w:pPr>
-      <w:spacing w:before="125"/>
-      <w:ind w:left="85"/>
-      <w:outlineLvl w:val="2"/>
-    </w:pPr>
-    <w:rPr>
-      <w:rFonts w:ascii="Arial" w:hAnsi="Arial" w:eastAsia="Arial" w:cs="Arial"/>
-      <w:b/>
-      <w:bCs/>
-      <w:sz w:val="21"/>
-      <w:szCs w:val="21"/>
-      <w:lang w:val="en-US" w:eastAsia="en-US" w:bidi="ar-SA"/>
-    </w:rPr>
-  </w:style>
-  <w:style w:type="paragraph" w:styleId="Heading3">
-    <w:name w:val="heading 3"/>
-    <w:basedOn w:val="Normal"/>
-    <w:uiPriority w:val="1"/>
-    <w:qFormat/>
-    <w:pPr>
-      <w:spacing w:before="136"/>
-      <w:ind w:left="85"/>
-      <w:outlineLvl w:val="3"/>
-    </w:pPr>
-    <w:rPr>
-      <w:rFonts w:ascii="Arial" w:hAnsi="Arial" w:eastAsia="Arial" w:cs="Arial"/>
-      <w:b/>
-      <w:bCs/>
-      <w:sz w:val="16"/>
-      <w:szCs w:val="16"/>
-      <w:lang w:val="en-US" w:eastAsia="en-US" w:bidi="ar-SA"/>
     </w:rPr>
   </w:style>
   <w:style w:type="paragraph" w:styleId="ListParagraph">
@@ -1490,12 +1983,8 @@
       <w:spacing w:before="71"/>
       <w:ind w:left="354" w:hanging="193"/>
     </w:pPr>
-    <w:rPr>
-      <w:rFonts w:ascii="Arial MT" w:hAnsi="Arial MT" w:eastAsia="Arial MT" w:cs="Arial MT"/>
-      <w:lang w:val="en-US" w:eastAsia="en-US" w:bidi="ar-SA"/>
-    </w:rPr>
   </w:style>
-  <w:style w:type="paragraph" w:styleId="TableParagraph">
+  <w:style w:type="paragraph" w:customStyle="1" w:styleId="TableParagraph">
     <w:name w:val="Table Paragraph"/>
     <w:basedOn w:val="Normal"/>
     <w:uiPriority w:val="1"/>
@@ -1505,9 +1994,53 @@
       <w:ind w:left="16"/>
       <w:jc w:val="center"/>
     </w:pPr>
+  </w:style>
+  <w:style w:type="paragraph" w:styleId="Header">
+    <w:name w:val="header"/>
+    <w:basedOn w:val="Normal"/>
+    <w:link w:val="HeaderChar"/>
+    <w:uiPriority w:val="99"/>
+    <w:unhideWhenUsed/>
+    <w:rsid w:val="00263F44"/>
+    <w:pPr>
+      <w:tabs>
+        <w:tab w:val="center" w:pos="4513"/>
+        <w:tab w:val="right" w:pos="9026"/>
+      </w:tabs>
+    </w:pPr>
+  </w:style>
+  <w:style w:type="character" w:customStyle="1" w:styleId="HeaderChar">
+    <w:name w:val="Header Char"/>
+    <w:basedOn w:val="DefaultParagraphFont"/>
+    <w:link w:val="Header"/>
+    <w:uiPriority w:val="99"/>
+    <w:rsid w:val="00263F44"/>
     <w:rPr>
-      <w:rFonts w:ascii="Arial MT" w:hAnsi="Arial MT" w:eastAsia="Arial MT" w:cs="Arial MT"/>
-      <w:lang w:val="en-US" w:eastAsia="en-US" w:bidi="ar-SA"/>
+      <w:rFonts w:ascii="Arial MT" w:eastAsia="Arial MT" w:hAnsi="Arial MT" w:cs="Arial MT"/>
+    </w:rPr>
+  </w:style>
+  <w:style w:type="paragraph" w:styleId="Footer">
+    <w:name w:val="footer"/>
+    <w:basedOn w:val="Normal"/>
+    <w:link w:val="FooterChar"/>
+    <w:uiPriority w:val="99"/>
+    <w:unhideWhenUsed/>
+    <w:rsid w:val="00263F44"/>
+    <w:pPr>
+      <w:tabs>
+        <w:tab w:val="center" w:pos="4513"/>
+        <w:tab w:val="right" w:pos="9026"/>
+      </w:tabs>
+    </w:pPr>
+  </w:style>
+  <w:style w:type="character" w:customStyle="1" w:styleId="FooterChar">
+    <w:name w:val="Footer Char"/>
+    <w:basedOn w:val="DefaultParagraphFont"/>
+    <w:link w:val="Footer"/>
+    <w:uiPriority w:val="99"/>
+    <w:rsid w:val="00263F44"/>
+    <w:rPr>
+      <w:rFonts w:ascii="Arial MT" w:eastAsia="Arial MT" w:hAnsi="Arial MT" w:cs="Arial MT"/>
     </w:rPr>
   </w:style>
 </w:styles>

</xml_diff>